<commit_message>
Update MLOps report with MLflow screenshots
</commit_message>
<xml_diff>
--- a/MLOps_Report.docx
+++ b/MLOps_Report.docx
@@ -4,7 +4,7 @@
   <w:body>
     <w:p>
       <w:pPr>
-        <w:spacing w:line="324" w:lineRule="auto" w:after="200"/>
+        <w:spacing w:line="324" w:lineRule="auto" w:after="280"/>
         <w:jc w:val="right"/>
         <w:bidi w:val="1"/>
       </w:pPr>
@@ -29,9 +29,9 @@
           <w:rFonts w:ascii="Arial" w:hAnsi="Arial" w:cs="Arial"/>
           <w:b/>
           <w:color w:val="2E74B5"/>
-          <w:sz w:val="30"/>
+          <w:sz w:val="28"/>
         </w:rPr>
-        <w:t>1. ملخص المشروع</w:t>
+        <w:t>1. فكرة المشروع</w:t>
       </w:r>
     </w:p>
     <w:p>
@@ -46,7 +46,7 @@
           <w:b w:val="0"/>
           <w:sz w:val="22"/>
         </w:rPr>
-        <w:t>المشروع عبارة عن مسألة تصنيف متعدد الكلاسات على بيانات جدولية مجهولة المعنى. الهدف هو تدريب نموذج يتنبأ بقيمة target لكل صف في test_data.csv، ثم توليد ملف submission.csv مطابق لصيغة Kaggle.</w:t>
+        <w:t>المشروع عبارة عن مسألة تصنيف متعدد الكلاسات على بيانات جدولية مجهولة المعنى. بما أن أسماء الخصائص لا تحمل معنى واضحاً، كان التركيز على بناء خط تدريب قابل للإعادة، وتجربة أكثر من نموذج، ثم توثيق النتائج بطريقة تسمح بمقارنة التجارب بدل الاعتماد على تجربة واحدة.</w:t>
       </w:r>
     </w:p>
     <w:p>
@@ -61,7 +61,7 @@
           <w:b w:val="0"/>
           <w:sz w:val="22"/>
         </w:rPr>
-        <w:t>اعتمدنا في التقييم الداخلي على Macro F1 لأنه يعطي وزناً متوازناً لكل كلاس، وهذا مهم لأن توزيع الكلاسات غير متساو. لذلك تابعنا أيضاً Balanced Accuracy وConfusion Matrix لفهم نوع الأخطاء.</w:t>
+        <w:t>استخدمنا Macro F1 كمقياس أساسي لأن توزيع الكلاسات غير متوازن. هذا المقياس يعطينا صورة أوضح عن أداء النموذج على كل كلاس، وليس فقط على الكلاس الأكبر.</w:t>
       </w:r>
     </w:p>
     <w:p>
@@ -75,439 +75,41 @@
           <w:rFonts w:ascii="Arial" w:hAnsi="Arial" w:cs="Arial"/>
           <w:b/>
           <w:color w:val="2E74B5"/>
-          <w:sz w:val="30"/>
+          <w:sz w:val="28"/>
         </w:rPr>
-        <w:t>2. سير العمل المختصر</w:t>
+        <w:t>2. منهجية التقييم</w:t>
       </w:r>
     </w:p>
-    <w:tbl>
-      <w:tblPr>
-        <w:tblStyle w:val="TableGrid"/>
-        <w:tblW w:type="auto" w:w="0"/>
-        <w:jc w:val="center"/>
-        <w:tblLook w:firstColumn="1" w:firstRow="1" w:lastColumn="0" w:lastRow="0" w:noHBand="0" w:noVBand="1" w:val="04A0"/>
-      </w:tblPr>
-      <w:tblGrid>
-        <w:gridCol w:w="3437"/>
-        <w:gridCol w:w="3437"/>
-        <w:gridCol w:w="3437"/>
-      </w:tblGrid>
-      <w:tr>
-        <w:tc>
-          <w:tcPr>
-            <w:tcW w:type="dxa" w:w="3437"/>
-            <w:shd w:fill="1F4E79"/>
-            <w:vAlign w:val="center"/>
-          </w:tcPr>
-          <w:p>
-            <w:pPr>
-              <w:spacing w:line="300" w:lineRule="auto" w:after="80"/>
-              <w:jc w:val="right"/>
-              <w:bidi w:val="1"/>
-            </w:pPr>
-            <w:r/>
-            <w:r>
-              <w:rPr>
-                <w:rFonts w:ascii="Arial" w:hAnsi="Arial" w:cs="Arial"/>
-                <w:b/>
-                <w:color w:val="FFFFFF"/>
-                <w:sz w:val="21"/>
-              </w:rPr>
-              <w:t>المرحلة</w:t>
-            </w:r>
-          </w:p>
-        </w:tc>
-        <w:tc>
-          <w:tcPr>
-            <w:tcW w:type="dxa" w:w="3437"/>
-            <w:shd w:fill="1F4E79"/>
-            <w:vAlign w:val="center"/>
-          </w:tcPr>
-          <w:p>
-            <w:pPr>
-              <w:spacing w:line="300" w:lineRule="auto" w:after="80"/>
-              <w:jc w:val="right"/>
-              <w:bidi w:val="1"/>
-            </w:pPr>
-            <w:r/>
-            <w:r>
-              <w:rPr>
-                <w:rFonts w:ascii="Arial" w:hAnsi="Arial" w:cs="Arial"/>
-                <w:b/>
-                <w:color w:val="FFFFFF"/>
-                <w:sz w:val="21"/>
-              </w:rPr>
-              <w:t>ماذا فعلنا؟</w:t>
-            </w:r>
-          </w:p>
-        </w:tc>
-        <w:tc>
-          <w:tcPr>
-            <w:tcW w:type="dxa" w:w="3437"/>
-            <w:shd w:fill="1F4E79"/>
-            <w:vAlign w:val="center"/>
-          </w:tcPr>
-          <w:p>
-            <w:pPr>
-              <w:spacing w:line="300" w:lineRule="auto" w:after="80"/>
-              <w:jc w:val="right"/>
-              <w:bidi w:val="1"/>
-            </w:pPr>
-            <w:r/>
-            <w:r>
-              <w:rPr>
-                <w:rFonts w:ascii="Arial" w:hAnsi="Arial" w:cs="Arial"/>
-                <w:b/>
-                <w:color w:val="FFFFFF"/>
-                <w:sz w:val="21"/>
-              </w:rPr>
-              <w:t>لماذا؟</w:t>
-            </w:r>
-          </w:p>
-        </w:tc>
-      </w:tr>
-      <w:tr>
-        <w:tc>
-          <w:tcPr>
-            <w:tcW w:type="dxa" w:w="3437"/>
-            <w:vAlign w:val="center"/>
-          </w:tcPr>
-          <w:p>
-            <w:pPr>
-              <w:spacing w:line="300" w:lineRule="auto" w:after="80"/>
-              <w:jc w:val="right"/>
-              <w:bidi w:val="1"/>
-            </w:pPr>
-            <w:r/>
-            <w:r>
-              <w:rPr>
-                <w:rFonts w:ascii="Arial" w:hAnsi="Arial" w:cs="Arial"/>
-                <w:b w:val="0"/>
-                <w:sz w:val="21"/>
-              </w:rPr>
-              <w:t>قراءة البيانات</w:t>
-            </w:r>
-          </w:p>
-        </w:tc>
-        <w:tc>
-          <w:tcPr>
-            <w:tcW w:type="dxa" w:w="3437"/>
-            <w:vAlign w:val="center"/>
-          </w:tcPr>
-          <w:p>
-            <w:pPr>
-              <w:spacing w:line="300" w:lineRule="auto" w:after="80"/>
-              <w:jc w:val="right"/>
-              <w:bidi w:val="1"/>
-            </w:pPr>
-            <w:r/>
-            <w:r>
-              <w:rPr>
-                <w:rFonts w:ascii="Arial" w:hAnsi="Arial" w:cs="Arial"/>
-                <w:b w:val="0"/>
-                <w:sz w:val="21"/>
-              </w:rPr>
-              <w:t>تحميل train_data.csv وtest_data.csv وsample_submission.csv</w:t>
-            </w:r>
-          </w:p>
-        </w:tc>
-        <w:tc>
-          <w:tcPr>
-            <w:tcW w:type="dxa" w:w="3437"/>
-            <w:vAlign w:val="center"/>
-          </w:tcPr>
-          <w:p>
-            <w:pPr>
-              <w:spacing w:line="300" w:lineRule="auto" w:after="80"/>
-              <w:jc w:val="right"/>
-              <w:bidi w:val="1"/>
-            </w:pPr>
-            <w:r/>
-            <w:r>
-              <w:rPr>
-                <w:rFonts w:ascii="Arial" w:hAnsi="Arial" w:cs="Arial"/>
-                <w:b w:val="0"/>
-                <w:sz w:val="21"/>
-              </w:rPr>
-              <w:t>التأكد من تطابق الأعمدة وصيغة الرفع</w:t>
-            </w:r>
-          </w:p>
-        </w:tc>
-      </w:tr>
-      <w:tr>
-        <w:tc>
-          <w:tcPr>
-            <w:tcW w:type="dxa" w:w="3437"/>
-            <w:vAlign w:val="center"/>
-          </w:tcPr>
-          <w:p>
-            <w:pPr>
-              <w:spacing w:line="300" w:lineRule="auto" w:after="80"/>
-              <w:jc w:val="right"/>
-              <w:bidi w:val="1"/>
-            </w:pPr>
-            <w:r/>
-            <w:r>
-              <w:rPr>
-                <w:rFonts w:ascii="Arial" w:hAnsi="Arial" w:cs="Arial"/>
-                <w:b w:val="0"/>
-                <w:sz w:val="21"/>
-              </w:rPr>
-              <w:t>تحليل أولي</w:t>
-            </w:r>
-          </w:p>
-        </w:tc>
-        <w:tc>
-          <w:tcPr>
-            <w:tcW w:type="dxa" w:w="3437"/>
-            <w:vAlign w:val="center"/>
-          </w:tcPr>
-          <w:p>
-            <w:pPr>
-              <w:spacing w:line="300" w:lineRule="auto" w:after="80"/>
-              <w:jc w:val="right"/>
-              <w:bidi w:val="1"/>
-            </w:pPr>
-            <w:r/>
-            <w:r>
-              <w:rPr>
-                <w:rFonts w:ascii="Arial" w:hAnsi="Arial" w:cs="Arial"/>
-                <w:b w:val="0"/>
-                <w:sz w:val="21"/>
-              </w:rPr>
-              <w:t>فحص توزيع الكلاسات والفروقات بين train وtest</w:t>
-            </w:r>
-          </w:p>
-        </w:tc>
-        <w:tc>
-          <w:tcPr>
-            <w:tcW w:type="dxa" w:w="3437"/>
-            <w:vAlign w:val="center"/>
-          </w:tcPr>
-          <w:p>
-            <w:pPr>
-              <w:spacing w:line="300" w:lineRule="auto" w:after="80"/>
-              <w:jc w:val="right"/>
-              <w:bidi w:val="1"/>
-            </w:pPr>
-            <w:r/>
-            <w:r>
-              <w:rPr>
-                <w:rFonts w:ascii="Arial" w:hAnsi="Arial" w:cs="Arial"/>
-                <w:b w:val="0"/>
-                <w:sz w:val="21"/>
-              </w:rPr>
-              <w:t>فهم طبيعة البيانات قبل النمذجة</w:t>
-            </w:r>
-          </w:p>
-        </w:tc>
-      </w:tr>
-      <w:tr>
-        <w:tc>
-          <w:tcPr>
-            <w:tcW w:type="dxa" w:w="3437"/>
-            <w:vAlign w:val="center"/>
-          </w:tcPr>
-          <w:p>
-            <w:pPr>
-              <w:spacing w:line="300" w:lineRule="auto" w:after="80"/>
-              <w:jc w:val="right"/>
-              <w:bidi w:val="1"/>
-            </w:pPr>
-            <w:r/>
-            <w:r>
-              <w:rPr>
-                <w:rFonts w:ascii="Arial" w:hAnsi="Arial" w:cs="Arial"/>
-                <w:b w:val="0"/>
-                <w:sz w:val="21"/>
-              </w:rPr>
-              <w:t>بناء الخصائص</w:t>
-            </w:r>
-          </w:p>
-        </w:tc>
-        <w:tc>
-          <w:tcPr>
-            <w:tcW w:type="dxa" w:w="3437"/>
-            <w:vAlign w:val="center"/>
-          </w:tcPr>
-          <w:p>
-            <w:pPr>
-              <w:spacing w:line="300" w:lineRule="auto" w:after="80"/>
-              <w:jc w:val="right"/>
-              <w:bidi w:val="1"/>
-            </w:pPr>
-            <w:r/>
-            <w:r>
-              <w:rPr>
-                <w:rFonts w:ascii="Arial" w:hAnsi="Arial" w:cs="Arial"/>
-                <w:b w:val="0"/>
-                <w:sz w:val="21"/>
-              </w:rPr>
-              <w:t>إضافة خصائص رقمية عامة مثل التفاعلات والنسب</w:t>
-            </w:r>
-          </w:p>
-        </w:tc>
-        <w:tc>
-          <w:tcPr>
-            <w:tcW w:type="dxa" w:w="3437"/>
-            <w:vAlign w:val="center"/>
-          </w:tcPr>
-          <w:p>
-            <w:pPr>
-              <w:spacing w:line="300" w:lineRule="auto" w:after="80"/>
-              <w:jc w:val="right"/>
-              <w:bidi w:val="1"/>
-            </w:pPr>
-            <w:r/>
-            <w:r>
-              <w:rPr>
-                <w:rFonts w:ascii="Arial" w:hAnsi="Arial" w:cs="Arial"/>
-                <w:b w:val="0"/>
-                <w:sz w:val="21"/>
-              </w:rPr>
-              <w:t>استخراج إشارات مفيدة من أعمدة مجهولة المعنى</w:t>
-            </w:r>
-          </w:p>
-        </w:tc>
-      </w:tr>
-      <w:tr>
-        <w:tc>
-          <w:tcPr>
-            <w:tcW w:type="dxa" w:w="3437"/>
-            <w:vAlign w:val="center"/>
-          </w:tcPr>
-          <w:p>
-            <w:pPr>
-              <w:spacing w:line="300" w:lineRule="auto" w:after="80"/>
-              <w:jc w:val="right"/>
-              <w:bidi w:val="1"/>
-            </w:pPr>
-            <w:r/>
-            <w:r>
-              <w:rPr>
-                <w:rFonts w:ascii="Arial" w:hAnsi="Arial" w:cs="Arial"/>
-                <w:b w:val="0"/>
-                <w:sz w:val="21"/>
-              </w:rPr>
-              <w:t>تدريب النماذج</w:t>
-            </w:r>
-          </w:p>
-        </w:tc>
-        <w:tc>
-          <w:tcPr>
-            <w:tcW w:type="dxa" w:w="3437"/>
-            <w:vAlign w:val="center"/>
-          </w:tcPr>
-          <w:p>
-            <w:pPr>
-              <w:spacing w:line="300" w:lineRule="auto" w:after="80"/>
-              <w:jc w:val="right"/>
-              <w:bidi w:val="1"/>
-            </w:pPr>
-            <w:r/>
-            <w:r>
-              <w:rPr>
-                <w:rFonts w:ascii="Arial" w:hAnsi="Arial" w:cs="Arial"/>
-                <w:b w:val="0"/>
-                <w:sz w:val="21"/>
-              </w:rPr>
-              <w:t>تجربة أشجار، boosting، وensemble</w:t>
-            </w:r>
-          </w:p>
-        </w:tc>
-        <w:tc>
-          <w:tcPr>
-            <w:tcW w:type="dxa" w:w="3437"/>
-            <w:vAlign w:val="center"/>
-          </w:tcPr>
-          <w:p>
-            <w:pPr>
-              <w:spacing w:line="300" w:lineRule="auto" w:after="80"/>
-              <w:jc w:val="right"/>
-              <w:bidi w:val="1"/>
-            </w:pPr>
-            <w:r/>
-            <w:r>
-              <w:rPr>
-                <w:rFonts w:ascii="Arial" w:hAnsi="Arial" w:cs="Arial"/>
-                <w:b w:val="0"/>
-                <w:sz w:val="21"/>
-              </w:rPr>
-              <w:t>مقارنة أكثر من عائلة نماذج</w:t>
-            </w:r>
-          </w:p>
-        </w:tc>
-      </w:tr>
-      <w:tr>
-        <w:tc>
-          <w:tcPr>
-            <w:tcW w:type="dxa" w:w="3437"/>
-            <w:vAlign w:val="center"/>
-          </w:tcPr>
-          <w:p>
-            <w:pPr>
-              <w:spacing w:line="300" w:lineRule="auto" w:after="80"/>
-              <w:jc w:val="right"/>
-              <w:bidi w:val="1"/>
-            </w:pPr>
-            <w:r/>
-            <w:r>
-              <w:rPr>
-                <w:rFonts w:ascii="Arial" w:hAnsi="Arial" w:cs="Arial"/>
-                <w:b w:val="0"/>
-                <w:sz w:val="21"/>
-              </w:rPr>
-              <w:t>تحليل الأخطاء</w:t>
-            </w:r>
-          </w:p>
-        </w:tc>
-        <w:tc>
-          <w:tcPr>
-            <w:tcW w:type="dxa" w:w="3437"/>
-            <w:vAlign w:val="center"/>
-          </w:tcPr>
-          <w:p>
-            <w:pPr>
-              <w:spacing w:line="300" w:lineRule="auto" w:after="80"/>
-              <w:jc w:val="right"/>
-              <w:bidi w:val="1"/>
-            </w:pPr>
-            <w:r/>
-            <w:r>
-              <w:rPr>
-                <w:rFonts w:ascii="Arial" w:hAnsi="Arial" w:cs="Arial"/>
-                <w:b w:val="0"/>
-                <w:sz w:val="21"/>
-              </w:rPr>
-              <w:t>حفظ OOF probabilities وconfusion matrices</w:t>
-            </w:r>
-          </w:p>
-        </w:tc>
-        <w:tc>
-          <w:tcPr>
-            <w:tcW w:type="dxa" w:w="3437"/>
-            <w:vAlign w:val="center"/>
-          </w:tcPr>
-          <w:p>
-            <w:pPr>
-              <w:spacing w:line="300" w:lineRule="auto" w:after="80"/>
-              <w:jc w:val="right"/>
-              <w:bidi w:val="1"/>
-            </w:pPr>
-            <w:r/>
-            <w:r>
-              <w:rPr>
-                <w:rFonts w:ascii="Arial" w:hAnsi="Arial" w:cs="Arial"/>
-                <w:b w:val="0"/>
-                <w:sz w:val="21"/>
-              </w:rPr>
-              <w:t>معرفة أين يخطئ النموذج</w:t>
-            </w:r>
-          </w:p>
-        </w:tc>
-      </w:tr>
-    </w:tbl>
-    <w:p/>
+    <w:p>
+      <w:pPr>
+        <w:spacing w:line="324" w:lineRule="auto" w:after="160"/>
+        <w:jc w:val="right"/>
+        <w:bidi w:val="1"/>
+      </w:pPr>
+      <w:r>
+        <w:rPr>
+          <w:rFonts w:ascii="Arial" w:hAnsi="Arial" w:cs="Arial"/>
+          <w:b w:val="0"/>
+          <w:sz w:val="22"/>
+        </w:rPr>
+        <w:t>اعتمدنا على StratifiedKFold حتى تبقى نسب الكلاسات متقاربة داخل كل fold. لكل نموذج سجلنا Accuracy وBalanced Accuracy وMacro F1، بالإضافة إلى اسم النموذج والإعدادات الأساسية.</w:t>
+      </w:r>
+    </w:p>
+    <w:p>
+      <w:pPr>
+        <w:spacing w:line="324" w:lineRule="auto" w:after="160"/>
+        <w:jc w:val="right"/>
+        <w:bidi w:val="1"/>
+      </w:pPr>
+      <w:r>
+        <w:rPr>
+          <w:rFonts w:ascii="Arial" w:hAnsi="Arial" w:cs="Arial"/>
+          <w:b w:val="0"/>
+          <w:sz w:val="22"/>
+        </w:rPr>
+        <w:t>بهذا الشكل أصبح القرار مبنياً على مقارنة داخلية واضحة بين النماذج، وليس على رقم واحد فقط.</w:t>
+      </w:r>
+    </w:p>
     <w:p>
       <w:pPr>
         <w:spacing w:line="324" w:lineRule="auto" w:after="200"/>
@@ -519,7 +121,7 @@
           <w:rFonts w:ascii="Arial" w:hAnsi="Arial" w:cs="Arial"/>
           <w:b/>
           <w:color w:val="2E74B5"/>
-          <w:sz w:val="30"/>
+          <w:sz w:val="28"/>
         </w:rPr>
         <w:t>3. تتبع التجارب باستخدام MLflow</w:t>
       </w:r>
@@ -536,7 +138,7 @@
           <w:b w:val="0"/>
           <w:sz w:val="22"/>
         </w:rPr>
-        <w:t>تم دمج MLflow داخل كود التدريب. كل تجربة تسجل اسم النموذج، الإعدادات، Accuracy، Balanced Accuracy، Macro F1، والملفات الناتجة.</w:t>
+        <w:t>تم دمج MLflow داخل كود التدريب. كل تجربة يتم تسجيلها كـ run مستقل يحتوي على اسم النموذج، الهدف من التجربة، المقاييس، وبعض الملفات الناتجة عند الحاجة.</w:t>
       </w:r>
     </w:p>
     <w:p>
@@ -556,6 +158,21 @@
     </w:p>
     <w:p>
       <w:pPr>
+        <w:spacing w:after="160"/>
+        <w:jc w:val="left"/>
+      </w:pPr>
+      <w:r>
+        <w:rPr>
+          <w:rFonts w:ascii="Arial" w:hAnsi="Arial" w:cs="Arial"/>
+          <w:b w:val="0"/>
+          <w:color w:val="282828"/>
+          <w:sz w:val="20"/>
+        </w:rPr>
+        <w:t>mlflow ui --backend-store-uri sqlite:///mlflow.db</w:t>
+      </w:r>
+    </w:p>
+    <w:p>
+      <w:pPr>
         <w:spacing w:line="324" w:lineRule="auto" w:after="160"/>
         <w:jc w:val="right"/>
         <w:bidi w:val="1"/>
@@ -563,11 +180,25 @@
       <w:r>
         <w:rPr>
           <w:rFonts w:ascii="Arial" w:hAnsi="Arial" w:cs="Arial"/>
-          <w:b w:val="0"/>
-          <w:color w:val="1F4E79"/>
+          <w:b/>
           <w:sz w:val="22"/>
         </w:rPr>
-        <w:t>mlflow ui --backend-store-uri sqlite:///mlflow.db</w:t>
+        <w:t>ثم فتح الرابط:</w:t>
+      </w:r>
+    </w:p>
+    <w:p>
+      <w:pPr>
+        <w:spacing w:after="160"/>
+        <w:jc w:val="left"/>
+      </w:pPr>
+      <w:r>
+        <w:rPr>
+          <w:rFonts w:ascii="Arial" w:hAnsi="Arial" w:cs="Arial"/>
+          <w:b w:val="0"/>
+          <w:color w:val="282828"/>
+          <w:sz w:val="20"/>
+        </w:rPr>
+        <w:t>http://127.0.0.1:5000</w:t>
       </w:r>
     </w:p>
     <w:p>
@@ -582,7 +213,62 @@
           <w:b w:val="0"/>
           <w:sz w:val="22"/>
         </w:rPr>
-        <w:t>ثم فتح الرابط: http://127.0.0.1:5000</w:t>
+        <w:t>الصورة التالية تعرض مجموعة من التجارب المسجلة، مع مقاييس المقارنة الأساسية مثل accuracy_mean وbalanced_accuracy_mean وf1_macro_mean.</w:t>
+      </w:r>
+    </w:p>
+    <w:p>
+      <w:pPr>
+        <w:jc w:val="center"/>
+      </w:pPr>
+      <w:r>
+        <w:drawing>
+          <wp:inline xmlns:a="http://schemas.openxmlformats.org/drawingml/2006/main" xmlns:pic="http://schemas.openxmlformats.org/drawingml/2006/picture">
+            <wp:extent cx="6192000" cy="2383194"/>
+            <wp:docPr id="1" name="Picture 1"/>
+            <wp:cNvGraphicFramePr>
+              <a:graphicFrameLocks noChangeAspect="1"/>
+            </wp:cNvGraphicFramePr>
+            <a:graphic>
+              <a:graphicData uri="http://schemas.openxmlformats.org/drawingml/2006/picture">
+                <pic:pic>
+                  <pic:nvPicPr>
+                    <pic:cNvPr id="0" name="لقطة الشاشة 2026-07-02 101224.png"/>
+                    <pic:cNvPicPr/>
+                  </pic:nvPicPr>
+                  <pic:blipFill>
+                    <a:blip r:embed="rId9"/>
+                    <a:stretch>
+                      <a:fillRect/>
+                    </a:stretch>
+                  </pic:blipFill>
+                  <pic:spPr>
+                    <a:xfrm>
+                      <a:off x="0" y="0"/>
+                      <a:ext cx="6192000" cy="2383194"/>
+                    </a:xfrm>
+                    <a:prstGeom prst="rect"/>
+                  </pic:spPr>
+                </pic:pic>
+              </a:graphicData>
+            </a:graphic>
+          </wp:inline>
+        </w:drawing>
+      </w:r>
+    </w:p>
+    <w:p>
+      <w:pPr>
+        <w:spacing w:line="324" w:lineRule="auto" w:after="280"/>
+        <w:jc w:val="right"/>
+        <w:bidi w:val="1"/>
+      </w:pPr>
+      <w:r>
+        <w:rPr>
+          <w:rFonts w:ascii="Arial" w:hAnsi="Arial" w:cs="Arial"/>
+          <w:b/>
+          <w:color w:val="595959"/>
+          <w:sz w:val="20"/>
+        </w:rPr>
+        <w:t>صورة 1: جدول MLflow لتجارب النماذج مع المقاييس الأساسية.</w:t>
       </w:r>
     </w:p>
     <w:p>
@@ -597,7 +283,62 @@
           <w:b w:val="0"/>
           <w:sz w:val="22"/>
         </w:rPr>
-        <w:t>يجب وضع Screenshot من جدول تجارب MLflow داخل التقرير النهائي بحيث تظهر runs متعددة والمقاييس المسجلة.</w:t>
+        <w:t>الصورة التالية تعرض تجارب الـ ensemble والفحوصات الإضافية مثل final_ensemble وreference_soft_voting_candidate، وفيها تظهر مقاييس oof_accuracy وoof_f1_macro.</w:t>
+      </w:r>
+    </w:p>
+    <w:p>
+      <w:pPr>
+        <w:jc w:val="center"/>
+      </w:pPr>
+      <w:r>
+        <w:drawing>
+          <wp:inline xmlns:a="http://schemas.openxmlformats.org/drawingml/2006/main" xmlns:pic="http://schemas.openxmlformats.org/drawingml/2006/picture">
+            <wp:extent cx="6192000" cy="2407700"/>
+            <wp:docPr id="2" name="Picture 2"/>
+            <wp:cNvGraphicFramePr>
+              <a:graphicFrameLocks noChangeAspect="1"/>
+            </wp:cNvGraphicFramePr>
+            <a:graphic>
+              <a:graphicData uri="http://schemas.openxmlformats.org/drawingml/2006/picture">
+                <pic:pic>
+                  <pic:nvPicPr>
+                    <pic:cNvPr id="0" name="لقطة الشاشة 2026-07-02 101231.png"/>
+                    <pic:cNvPicPr/>
+                  </pic:nvPicPr>
+                  <pic:blipFill>
+                    <a:blip r:embed="rId10"/>
+                    <a:stretch>
+                      <a:fillRect/>
+                    </a:stretch>
+                  </pic:blipFill>
+                  <pic:spPr>
+                    <a:xfrm>
+                      <a:off x="0" y="0"/>
+                      <a:ext cx="6192000" cy="2407700"/>
+                    </a:xfrm>
+                    <a:prstGeom prst="rect"/>
+                  </pic:spPr>
+                </pic:pic>
+              </a:graphicData>
+            </a:graphic>
+          </wp:inline>
+        </w:drawing>
+      </w:r>
+    </w:p>
+    <w:p>
+      <w:pPr>
+        <w:spacing w:line="324" w:lineRule="auto" w:after="280"/>
+        <w:jc w:val="right"/>
+        <w:bidi w:val="1"/>
+      </w:pPr>
+      <w:r>
+        <w:rPr>
+          <w:rFonts w:ascii="Arial" w:hAnsi="Arial" w:cs="Arial"/>
+          <w:b/>
+          <w:color w:val="595959"/>
+          <w:sz w:val="20"/>
+        </w:rPr>
+        <w:t>صورة 2: جدول MLflow لتجارب الـ ensemble والفحوصات الإضافية.</w:t>
       </w:r>
     </w:p>
     <w:p>
@@ -611,9 +352,9 @@
           <w:rFonts w:ascii="Arial" w:hAnsi="Arial" w:cs="Arial"/>
           <w:b/>
           <w:color w:val="2E74B5"/>
-          <w:sz w:val="30"/>
+          <w:sz w:val="28"/>
         </w:rPr>
-        <w:t>4. التجارب التي تم توثيقها</w:t>
+        <w:t>4. التجارب التي تمت مقارنتها</w:t>
       </w:r>
     </w:p>
     <w:tbl>
@@ -624,19 +365,19 @@
         <w:tblLook w:firstColumn="1" w:firstRow="1" w:lastColumn="0" w:lastRow="0" w:noHBand="0" w:noVBand="1" w:val="04A0"/>
       </w:tblPr>
       <w:tblGrid>
-        <w:gridCol w:w="5156"/>
-        <w:gridCol w:w="5156"/>
+        <w:gridCol w:w="5270"/>
+        <w:gridCol w:w="5270"/>
       </w:tblGrid>
       <w:tr>
         <w:tc>
           <w:tcPr>
-            <w:tcW w:type="dxa" w:w="5156"/>
+            <w:tcW w:type="dxa" w:w="5270"/>
             <w:shd w:fill="1F4E79"/>
             <w:vAlign w:val="center"/>
           </w:tcPr>
           <w:p>
             <w:pPr>
-              <w:spacing w:line="300" w:lineRule="auto" w:after="80"/>
+              <w:spacing w:line="300" w:lineRule="auto" w:after="100"/>
               <w:jc w:val="right"/>
               <w:bidi w:val="1"/>
             </w:pPr>
@@ -654,13 +395,13 @@
         </w:tc>
         <w:tc>
           <w:tcPr>
-            <w:tcW w:type="dxa" w:w="5156"/>
+            <w:tcW w:type="dxa" w:w="5270"/>
             <w:shd w:fill="1F4E79"/>
             <w:vAlign w:val="center"/>
           </w:tcPr>
           <w:p>
             <w:pPr>
-              <w:spacing w:line="300" w:lineRule="auto" w:after="80"/>
+              <w:spacing w:line="300" w:lineRule="auto" w:after="100"/>
               <w:jc w:val="right"/>
               <w:bidi w:val="1"/>
             </w:pPr>
@@ -672,7 +413,7 @@
                 <w:color w:val="FFFFFF"/>
                 <w:sz w:val="21"/>
               </w:rPr>
-              <w:t>الهدف منها</w:t>
+              <w:t>الهدف</w:t>
             </w:r>
           </w:p>
         </w:tc>
@@ -680,12 +421,12 @@
       <w:tr>
         <w:tc>
           <w:tcPr>
-            <w:tcW w:type="dxa" w:w="5156"/>
+            <w:tcW w:type="dxa" w:w="5270"/>
             <w:vAlign w:val="center"/>
           </w:tcPr>
           <w:p>
             <w:pPr>
-              <w:spacing w:line="300" w:lineRule="auto" w:after="80"/>
+              <w:spacing w:line="300" w:lineRule="auto" w:after="100"/>
               <w:jc w:val="right"/>
               <w:bidi w:val="1"/>
             </w:pPr>
@@ -696,18 +437,18 @@
                 <w:b w:val="0"/>
                 <w:sz w:val="21"/>
               </w:rPr>
-              <w:t>Baseline models</w:t>
+              <w:t>Decision Tree و Bagging</w:t>
             </w:r>
           </w:p>
         </w:tc>
         <w:tc>
           <w:tcPr>
-            <w:tcW w:type="dxa" w:w="5156"/>
+            <w:tcW w:type="dxa" w:w="5270"/>
             <w:vAlign w:val="center"/>
           </w:tcPr>
           <w:p>
             <w:pPr>
-              <w:spacing w:line="300" w:lineRule="auto" w:after="80"/>
+              <w:spacing w:line="300" w:lineRule="auto" w:after="100"/>
               <w:jc w:val="right"/>
               <w:bidi w:val="1"/>
             </w:pPr>
@@ -718,7 +459,7 @@
                 <w:b w:val="0"/>
                 <w:sz w:val="21"/>
               </w:rPr>
-              <w:t>معرفة الأداء الأولي قبل التعقيد</w:t>
+              <w:t>اختبار قدرة الأشجار على التقاط الأنماط الواضحة في الخصائص.</w:t>
             </w:r>
           </w:p>
         </w:tc>
@@ -726,12 +467,12 @@
       <w:tr>
         <w:tc>
           <w:tcPr>
-            <w:tcW w:type="dxa" w:w="5156"/>
+            <w:tcW w:type="dxa" w:w="5270"/>
             <w:vAlign w:val="center"/>
           </w:tcPr>
           <w:p>
             <w:pPr>
-              <w:spacing w:line="300" w:lineRule="auto" w:after="80"/>
+              <w:spacing w:line="300" w:lineRule="auto" w:after="100"/>
               <w:jc w:val="right"/>
               <w:bidi w:val="1"/>
             </w:pPr>
@@ -742,18 +483,18 @@
                 <w:b w:val="0"/>
                 <w:sz w:val="21"/>
               </w:rPr>
-              <w:t>Decision Tree / Bagging</w:t>
+              <w:t>Random Forest و Extra Trees</w:t>
             </w:r>
           </w:p>
         </w:tc>
         <w:tc>
           <w:tcPr>
-            <w:tcW w:type="dxa" w:w="5156"/>
+            <w:tcW w:type="dxa" w:w="5270"/>
             <w:vAlign w:val="center"/>
           </w:tcPr>
           <w:p>
             <w:pPr>
-              <w:spacing w:line="300" w:lineRule="auto" w:after="80"/>
+              <w:spacing w:line="300" w:lineRule="auto" w:after="100"/>
               <w:jc w:val="right"/>
               <w:bidi w:val="1"/>
             </w:pPr>
@@ -764,7 +505,7 @@
                 <w:b w:val="0"/>
                 <w:sz w:val="21"/>
               </w:rPr>
-              <w:t>اختبار قدرة الأشجار على التقاط الأنماط الواضحة</w:t>
+              <w:t>تقليل تذبذب الشجرة الواحدة عبر تجميع عدة أشجار.</w:t>
             </w:r>
           </w:p>
         </w:tc>
@@ -772,12 +513,12 @@
       <w:tr>
         <w:tc>
           <w:tcPr>
-            <w:tcW w:type="dxa" w:w="5156"/>
+            <w:tcW w:type="dxa" w:w="5270"/>
             <w:vAlign w:val="center"/>
           </w:tcPr>
           <w:p>
             <w:pPr>
-              <w:spacing w:line="300" w:lineRule="auto" w:after="80"/>
+              <w:spacing w:line="300" w:lineRule="auto" w:after="100"/>
               <w:jc w:val="right"/>
               <w:bidi w:val="1"/>
             </w:pPr>
@@ -788,18 +529,18 @@
                 <w:b w:val="0"/>
                 <w:sz w:val="21"/>
               </w:rPr>
-              <w:t>Random Forest / Extra Trees</w:t>
+              <w:t>Gradient Boosting و HistGradientBoosting</w:t>
             </w:r>
           </w:p>
         </w:tc>
         <w:tc>
           <w:tcPr>
-            <w:tcW w:type="dxa" w:w="5156"/>
+            <w:tcW w:type="dxa" w:w="5270"/>
             <w:vAlign w:val="center"/>
           </w:tcPr>
           <w:p>
             <w:pPr>
-              <w:spacing w:line="300" w:lineRule="auto" w:after="80"/>
+              <w:spacing w:line="300" w:lineRule="auto" w:after="100"/>
               <w:jc w:val="right"/>
               <w:bidi w:val="1"/>
             </w:pPr>
@@ -810,7 +551,7 @@
                 <w:b w:val="0"/>
                 <w:sz w:val="21"/>
               </w:rPr>
-              <w:t>تقليل تذبذب الشجرة الواحدة</w:t>
+              <w:t>تجربة نماذج boosting مناسبة للبيانات الجدولية.</w:t>
             </w:r>
           </w:p>
         </w:tc>
@@ -818,12 +559,12 @@
       <w:tr>
         <w:tc>
           <w:tcPr>
-            <w:tcW w:type="dxa" w:w="5156"/>
+            <w:tcW w:type="dxa" w:w="5270"/>
             <w:vAlign w:val="center"/>
           </w:tcPr>
           <w:p>
             <w:pPr>
-              <w:spacing w:line="300" w:lineRule="auto" w:after="80"/>
+              <w:spacing w:line="300" w:lineRule="auto" w:after="100"/>
               <w:jc w:val="right"/>
               <w:bidi w:val="1"/>
             </w:pPr>
@@ -834,18 +575,18 @@
                 <w:b w:val="0"/>
                 <w:sz w:val="21"/>
               </w:rPr>
-              <w:t>LightGBM / XGBoost</w:t>
+              <w:t>LightGBM و XGBoost</w:t>
             </w:r>
           </w:p>
         </w:tc>
         <w:tc>
           <w:tcPr>
-            <w:tcW w:type="dxa" w:w="5156"/>
+            <w:tcW w:type="dxa" w:w="5270"/>
             <w:vAlign w:val="center"/>
           </w:tcPr>
           <w:p>
             <w:pPr>
-              <w:spacing w:line="300" w:lineRule="auto" w:after="80"/>
+              <w:spacing w:line="300" w:lineRule="auto" w:after="100"/>
               <w:jc w:val="right"/>
               <w:bidi w:val="1"/>
             </w:pPr>
@@ -856,7 +597,7 @@
                 <w:b w:val="0"/>
                 <w:sz w:val="21"/>
               </w:rPr>
-              <w:t>تجربة نماذج boosting قوية للبيانات الجدولية</w:t>
+              <w:t>اختبار نماذج قوية على tabular data.</w:t>
             </w:r>
           </w:p>
         </w:tc>
@@ -864,12 +605,12 @@
       <w:tr>
         <w:tc>
           <w:tcPr>
-            <w:tcW w:type="dxa" w:w="5156"/>
+            <w:tcW w:type="dxa" w:w="5270"/>
             <w:vAlign w:val="center"/>
           </w:tcPr>
           <w:p>
             <w:pPr>
-              <w:spacing w:line="300" w:lineRule="auto" w:after="80"/>
+              <w:spacing w:line="300" w:lineRule="auto" w:after="100"/>
               <w:jc w:val="right"/>
               <w:bidi w:val="1"/>
             </w:pPr>
@@ -886,12 +627,12 @@
         </w:tc>
         <w:tc>
           <w:tcPr>
-            <w:tcW w:type="dxa" w:w="5156"/>
+            <w:tcW w:type="dxa" w:w="5270"/>
             <w:vAlign w:val="center"/>
           </w:tcPr>
           <w:p>
             <w:pPr>
-              <w:spacing w:line="300" w:lineRule="auto" w:after="80"/>
+              <w:spacing w:line="300" w:lineRule="auto" w:after="100"/>
               <w:jc w:val="right"/>
               <w:bidi w:val="1"/>
             </w:pPr>
@@ -902,7 +643,7 @@
                 <w:b w:val="0"/>
                 <w:sz w:val="21"/>
               </w:rPr>
-              <w:t>مقارنة النموذج مع وبدون class weights</w:t>
+              <w:t>مقارنة أثر إزالة class weights.</w:t>
             </w:r>
           </w:p>
         </w:tc>
@@ -910,12 +651,12 @@
       <w:tr>
         <w:tc>
           <w:tcPr>
-            <w:tcW w:type="dxa" w:w="5156"/>
+            <w:tcW w:type="dxa" w:w="5270"/>
             <w:vAlign w:val="center"/>
           </w:tcPr>
           <w:p>
             <w:pPr>
-              <w:spacing w:line="300" w:lineRule="auto" w:after="80"/>
+              <w:spacing w:line="300" w:lineRule="auto" w:after="100"/>
               <w:jc w:val="right"/>
               <w:bidi w:val="1"/>
             </w:pPr>
@@ -932,12 +673,12 @@
         </w:tc>
         <w:tc>
           <w:tcPr>
-            <w:tcW w:type="dxa" w:w="5156"/>
+            <w:tcW w:type="dxa" w:w="5270"/>
             <w:vAlign w:val="center"/>
           </w:tcPr>
           <w:p>
             <w:pPr>
-              <w:spacing w:line="300" w:lineRule="auto" w:after="80"/>
+              <w:spacing w:line="300" w:lineRule="auto" w:after="100"/>
               <w:jc w:val="right"/>
               <w:bidi w:val="1"/>
             </w:pPr>
@@ -948,7 +689,7 @@
                 <w:b w:val="0"/>
                 <w:sz w:val="21"/>
               </w:rPr>
-              <w:t>اختبار نموذج صغير يعتمد على f10 وf12 وf14 وf9</w:t>
+              <w:t>اختبار نموذج صغير يعتمد على أكثر الخصائص ظهوراً في التحليل.</w:t>
             </w:r>
           </w:p>
         </w:tc>
@@ -956,12 +697,12 @@
       <w:tr>
         <w:tc>
           <w:tcPr>
-            <w:tcW w:type="dxa" w:w="5156"/>
+            <w:tcW w:type="dxa" w:w="5270"/>
             <w:vAlign w:val="center"/>
           </w:tcPr>
           <w:p>
             <w:pPr>
-              <w:spacing w:line="300" w:lineRule="auto" w:after="80"/>
+              <w:spacing w:line="300" w:lineRule="auto" w:after="100"/>
               <w:jc w:val="right"/>
               <w:bidi w:val="1"/>
             </w:pPr>
@@ -972,18 +713,18 @@
                 <w:b w:val="0"/>
                 <w:sz w:val="21"/>
               </w:rPr>
-              <w:t>ADASYN / BorderlineSMOTE audit</w:t>
+              <w:t>ADASYN و BorderlineSMOTE</w:t>
             </w:r>
           </w:p>
         </w:tc>
         <w:tc>
           <w:tcPr>
-            <w:tcW w:type="dxa" w:w="5156"/>
+            <w:tcW w:type="dxa" w:w="5270"/>
             <w:vAlign w:val="center"/>
           </w:tcPr>
           <w:p>
             <w:pPr>
-              <w:spacing w:line="300" w:lineRule="auto" w:after="80"/>
+              <w:spacing w:line="300" w:lineRule="auto" w:after="100"/>
               <w:jc w:val="right"/>
               <w:bidi w:val="1"/>
             </w:pPr>
@@ -994,7 +735,7 @@
                 <w:b w:val="0"/>
                 <w:sz w:val="21"/>
               </w:rPr>
-              <w:t>فحص أثر توليد أمثلة إضافية للفئات الأقل عدداً</w:t>
+              <w:t>فحص أثر توليد أمثلة إضافية للفئات الأقل عدداً.</w:t>
             </w:r>
           </w:p>
         </w:tc>
@@ -1002,12 +743,12 @@
       <w:tr>
         <w:tc>
           <w:tcPr>
-            <w:tcW w:type="dxa" w:w="5156"/>
+            <w:tcW w:type="dxa" w:w="5270"/>
             <w:vAlign w:val="center"/>
           </w:tcPr>
           <w:p>
             <w:pPr>
-              <w:spacing w:line="300" w:lineRule="auto" w:after="80"/>
+              <w:spacing w:line="300" w:lineRule="auto" w:after="100"/>
               <w:jc w:val="right"/>
               <w:bidi w:val="1"/>
             </w:pPr>
@@ -1018,18 +759,18 @@
                 <w:b w:val="0"/>
                 <w:sz w:val="21"/>
               </w:rPr>
-              <w:t>Reference Soft Voting Candidate</w:t>
+              <w:t>Soft Voting Ensemble</w:t>
             </w:r>
           </w:p>
         </w:tc>
         <w:tc>
           <w:tcPr>
-            <w:tcW w:type="dxa" w:w="5156"/>
+            <w:tcW w:type="dxa" w:w="5270"/>
             <w:vAlign w:val="center"/>
           </w:tcPr>
           <w:p>
             <w:pPr>
-              <w:spacing w:line="300" w:lineRule="auto" w:after="80"/>
+              <w:spacing w:line="300" w:lineRule="auto" w:after="100"/>
               <w:jc w:val="right"/>
               <w:bidi w:val="1"/>
             </w:pPr>
@@ -1040,13 +781,28 @@
                 <w:b w:val="0"/>
                 <w:sz w:val="21"/>
               </w:rPr>
-              <w:t>مرشح ensemble مبني على دمج احتمالات عدة نماذج</w:t>
+              <w:t>دمج احتمالات عدة نماذج عندما تكون أخطاؤها مختلفة.</w:t>
             </w:r>
           </w:p>
         </w:tc>
       </w:tr>
     </w:tbl>
     <w:p/>
+    <w:p>
+      <w:pPr>
+        <w:spacing w:line="324" w:lineRule="auto" w:after="160"/>
+        <w:jc w:val="right"/>
+        <w:bidi w:val="1"/>
+      </w:pPr>
+      <w:r>
+        <w:rPr>
+          <w:rFonts w:ascii="Arial" w:hAnsi="Arial" w:cs="Arial"/>
+          <w:b w:val="0"/>
+          <w:sz w:val="22"/>
+        </w:rPr>
+        <w:t>الهدف من هذه التجارب لم يكن فقط رفع النتيجة، بل معرفة أي النماذج أكثر ثباتاً وأيها يعطي أداء جيداً على الكلاسات الأقل عدداً.</w:t>
+      </w:r>
+    </w:p>
     <w:p>
       <w:pPr>
         <w:spacing w:line="324" w:lineRule="auto" w:after="200"/>
@@ -1058,410 +814,9 @@
           <w:rFonts w:ascii="Arial" w:hAnsi="Arial" w:cs="Arial"/>
           <w:b/>
           <w:color w:val="2E74B5"/>
-          <w:sz w:val="30"/>
+          <w:sz w:val="28"/>
         </w:rPr>
-        <w:t>5. الملفات التحليلية الناتجة</w:t>
-      </w:r>
-    </w:p>
-    <w:tbl>
-      <w:tblPr>
-        <w:tblStyle w:val="TableGrid"/>
-        <w:tblW w:type="auto" w:w="0"/>
-        <w:jc w:val="center"/>
-        <w:tblLook w:firstColumn="1" w:firstRow="1" w:lastColumn="0" w:lastRow="0" w:noHBand="0" w:noVBand="1" w:val="04A0"/>
-      </w:tblPr>
-      <w:tblGrid>
-        <w:gridCol w:w="5156"/>
-        <w:gridCol w:w="5156"/>
-      </w:tblGrid>
-      <w:tr>
-        <w:tc>
-          <w:tcPr>
-            <w:tcW w:type="dxa" w:w="5156"/>
-            <w:shd w:fill="1F4E79"/>
-            <w:vAlign w:val="center"/>
-          </w:tcPr>
-          <w:p>
-            <w:pPr>
-              <w:spacing w:line="300" w:lineRule="auto" w:after="80"/>
-              <w:jc w:val="right"/>
-              <w:bidi w:val="1"/>
-            </w:pPr>
-            <w:r/>
-            <w:r>
-              <w:rPr>
-                <w:rFonts w:ascii="Arial" w:hAnsi="Arial" w:cs="Arial"/>
-                <w:b/>
-                <w:color w:val="FFFFFF"/>
-                <w:sz w:val="21"/>
-              </w:rPr>
-              <w:t>الملف</w:t>
-            </w:r>
-          </w:p>
-        </w:tc>
-        <w:tc>
-          <w:tcPr>
-            <w:tcW w:type="dxa" w:w="5156"/>
-            <w:shd w:fill="1F4E79"/>
-            <w:vAlign w:val="center"/>
-          </w:tcPr>
-          <w:p>
-            <w:pPr>
-              <w:spacing w:line="300" w:lineRule="auto" w:after="80"/>
-              <w:jc w:val="right"/>
-              <w:bidi w:val="1"/>
-            </w:pPr>
-            <w:r/>
-            <w:r>
-              <w:rPr>
-                <w:rFonts w:ascii="Arial" w:hAnsi="Arial" w:cs="Arial"/>
-                <w:b/>
-                <w:color w:val="FFFFFF"/>
-                <w:sz w:val="21"/>
-              </w:rPr>
-              <w:t>فائدته</w:t>
-            </w:r>
-          </w:p>
-        </w:tc>
-      </w:tr>
-      <w:tr>
-        <w:tc>
-          <w:tcPr>
-            <w:tcW w:type="dxa" w:w="5156"/>
-            <w:vAlign w:val="center"/>
-          </w:tcPr>
-          <w:p>
-            <w:pPr>
-              <w:spacing w:line="300" w:lineRule="auto" w:after="80"/>
-              <w:jc w:val="right"/>
-              <w:bidi w:val="1"/>
-            </w:pPr>
-            <w:r/>
-            <w:r>
-              <w:rPr>
-                <w:rFonts w:ascii="Arial" w:hAnsi="Arial" w:cs="Arial"/>
-                <w:b w:val="0"/>
-                <w:sz w:val="21"/>
-              </w:rPr>
-              <w:t>classification_artifacts/cv_results.csv</w:t>
-            </w:r>
-          </w:p>
-        </w:tc>
-        <w:tc>
-          <w:tcPr>
-            <w:tcW w:type="dxa" w:w="5156"/>
-            <w:vAlign w:val="center"/>
-          </w:tcPr>
-          <w:p>
-            <w:pPr>
-              <w:spacing w:line="300" w:lineRule="auto" w:after="80"/>
-              <w:jc w:val="right"/>
-              <w:bidi w:val="1"/>
-            </w:pPr>
-            <w:r/>
-            <w:r>
-              <w:rPr>
-                <w:rFonts w:ascii="Arial" w:hAnsi="Arial" w:cs="Arial"/>
-                <w:b w:val="0"/>
-                <w:sz w:val="21"/>
-              </w:rPr>
-              <w:t>ترتيب النماذج حسب cross-validation</w:t>
-            </w:r>
-          </w:p>
-        </w:tc>
-      </w:tr>
-      <w:tr>
-        <w:tc>
-          <w:tcPr>
-            <w:tcW w:type="dxa" w:w="5156"/>
-            <w:vAlign w:val="center"/>
-          </w:tcPr>
-          <w:p>
-            <w:pPr>
-              <w:spacing w:line="300" w:lineRule="auto" w:after="80"/>
-              <w:jc w:val="right"/>
-              <w:bidi w:val="1"/>
-            </w:pPr>
-            <w:r/>
-            <w:r>
-              <w:rPr>
-                <w:rFonts w:ascii="Arial" w:hAnsi="Arial" w:cs="Arial"/>
-                <w:b w:val="0"/>
-                <w:sz w:val="21"/>
-              </w:rPr>
-              <w:t>classification_artifacts/model_submission_portfolio.csv</w:t>
-            </w:r>
-          </w:p>
-        </w:tc>
-        <w:tc>
-          <w:tcPr>
-            <w:tcW w:type="dxa" w:w="5156"/>
-            <w:vAlign w:val="center"/>
-          </w:tcPr>
-          <w:p>
-            <w:pPr>
-              <w:spacing w:line="300" w:lineRule="auto" w:after="80"/>
-              <w:jc w:val="right"/>
-              <w:bidi w:val="1"/>
-            </w:pPr>
-            <w:r/>
-            <w:r>
-              <w:rPr>
-                <w:rFonts w:ascii="Arial" w:hAnsi="Arial" w:cs="Arial"/>
-                <w:b w:val="0"/>
-                <w:sz w:val="21"/>
-              </w:rPr>
-              <w:t>قائمة ملفات الرفع المرشحة لكل موديل</w:t>
-            </w:r>
-          </w:p>
-        </w:tc>
-      </w:tr>
-      <w:tr>
-        <w:tc>
-          <w:tcPr>
-            <w:tcW w:type="dxa" w:w="5156"/>
-            <w:vAlign w:val="center"/>
-          </w:tcPr>
-          <w:p>
-            <w:pPr>
-              <w:spacing w:line="300" w:lineRule="auto" w:after="80"/>
-              <w:jc w:val="right"/>
-              <w:bidi w:val="1"/>
-            </w:pPr>
-            <w:r/>
-            <w:r>
-              <w:rPr>
-                <w:rFonts w:ascii="Arial" w:hAnsi="Arial" w:cs="Arial"/>
-                <w:b w:val="0"/>
-                <w:sz w:val="21"/>
-              </w:rPr>
-              <w:t>classification_artifacts/model_oof_confusion_matrices.csv</w:t>
-            </w:r>
-          </w:p>
-        </w:tc>
-        <w:tc>
-          <w:tcPr>
-            <w:tcW w:type="dxa" w:w="5156"/>
-            <w:vAlign w:val="center"/>
-          </w:tcPr>
-          <w:p>
-            <w:pPr>
-              <w:spacing w:line="300" w:lineRule="auto" w:after="80"/>
-              <w:jc w:val="right"/>
-              <w:bidi w:val="1"/>
-            </w:pPr>
-            <w:r/>
-            <w:r>
-              <w:rPr>
-                <w:rFonts w:ascii="Arial" w:hAnsi="Arial" w:cs="Arial"/>
-                <w:b w:val="0"/>
-                <w:sz w:val="21"/>
-              </w:rPr>
-              <w:t>مصفوفة الالتباس لكل موديل</w:t>
-            </w:r>
-          </w:p>
-        </w:tc>
-      </w:tr>
-      <w:tr>
-        <w:tc>
-          <w:tcPr>
-            <w:tcW w:type="dxa" w:w="5156"/>
-            <w:vAlign w:val="center"/>
-          </w:tcPr>
-          <w:p>
-            <w:pPr>
-              <w:spacing w:line="300" w:lineRule="auto" w:after="80"/>
-              <w:jc w:val="right"/>
-              <w:bidi w:val="1"/>
-            </w:pPr>
-            <w:r/>
-            <w:r>
-              <w:rPr>
-                <w:rFonts w:ascii="Arial" w:hAnsi="Arial" w:cs="Arial"/>
-                <w:b w:val="0"/>
-                <w:sz w:val="21"/>
-              </w:rPr>
-              <w:t>classification_artifacts/oof_probability_audit.csv</w:t>
-            </w:r>
-          </w:p>
-        </w:tc>
-        <w:tc>
-          <w:tcPr>
-            <w:tcW w:type="dxa" w:w="5156"/>
-            <w:vAlign w:val="center"/>
-          </w:tcPr>
-          <w:p>
-            <w:pPr>
-              <w:spacing w:line="300" w:lineRule="auto" w:after="80"/>
-              <w:jc w:val="right"/>
-              <w:bidi w:val="1"/>
-            </w:pPr>
-            <w:r/>
-            <w:r>
-              <w:rPr>
-                <w:rFonts w:ascii="Arial" w:hAnsi="Arial" w:cs="Arial"/>
-                <w:b w:val="0"/>
-                <w:sz w:val="21"/>
-              </w:rPr>
-              <w:t>احتمالات OOF لكل صف</w:t>
-            </w:r>
-          </w:p>
-        </w:tc>
-      </w:tr>
-      <w:tr>
-        <w:tc>
-          <w:tcPr>
-            <w:tcW w:type="dxa" w:w="5156"/>
-            <w:vAlign w:val="center"/>
-          </w:tcPr>
-          <w:p>
-            <w:pPr>
-              <w:spacing w:line="300" w:lineRule="auto" w:after="80"/>
-              <w:jc w:val="right"/>
-              <w:bidi w:val="1"/>
-            </w:pPr>
-            <w:r/>
-            <w:r>
-              <w:rPr>
-                <w:rFonts w:ascii="Arial" w:hAnsi="Arial" w:cs="Arial"/>
-                <w:b w:val="0"/>
-                <w:sz w:val="21"/>
-              </w:rPr>
-              <w:t>classification_artifacts/hard_sampling_adasyn_results.csv</w:t>
-            </w:r>
-          </w:p>
-        </w:tc>
-        <w:tc>
-          <w:tcPr>
-            <w:tcW w:type="dxa" w:w="5156"/>
-            <w:vAlign w:val="center"/>
-          </w:tcPr>
-          <w:p>
-            <w:pPr>
-              <w:spacing w:line="300" w:lineRule="auto" w:after="80"/>
-              <w:jc w:val="right"/>
-              <w:bidi w:val="1"/>
-            </w:pPr>
-            <w:r/>
-            <w:r>
-              <w:rPr>
-                <w:rFonts w:ascii="Arial" w:hAnsi="Arial" w:cs="Arial"/>
-                <w:b w:val="0"/>
-                <w:sz w:val="21"/>
-              </w:rPr>
-              <w:t>نتائج ADASYN وBorderlineSMOTE</w:t>
-            </w:r>
-          </w:p>
-        </w:tc>
-      </w:tr>
-      <w:tr>
-        <w:tc>
-          <w:tcPr>
-            <w:tcW w:type="dxa" w:w="5156"/>
-            <w:vAlign w:val="center"/>
-          </w:tcPr>
-          <w:p>
-            <w:pPr>
-              <w:spacing w:line="300" w:lineRule="auto" w:after="80"/>
-              <w:jc w:val="right"/>
-              <w:bidi w:val="1"/>
-            </w:pPr>
-            <w:r/>
-            <w:r>
-              <w:rPr>
-                <w:rFonts w:ascii="Arial" w:hAnsi="Arial" w:cs="Arial"/>
-                <w:b w:val="0"/>
-                <w:sz w:val="21"/>
-              </w:rPr>
-              <w:t>classification_artifacts/final_artifact_smoke_test.json</w:t>
-            </w:r>
-          </w:p>
-        </w:tc>
-        <w:tc>
-          <w:tcPr>
-            <w:tcW w:type="dxa" w:w="5156"/>
-            <w:vAlign w:val="center"/>
-          </w:tcPr>
-          <w:p>
-            <w:pPr>
-              <w:spacing w:line="300" w:lineRule="auto" w:after="80"/>
-              <w:jc w:val="right"/>
-              <w:bidi w:val="1"/>
-            </w:pPr>
-            <w:r/>
-            <w:r>
-              <w:rPr>
-                <w:rFonts w:ascii="Arial" w:hAnsi="Arial" w:cs="Arial"/>
-                <w:b w:val="0"/>
-                <w:sz w:val="21"/>
-              </w:rPr>
-              <w:t>فحص إعادة توليد نفس submission</w:t>
-            </w:r>
-          </w:p>
-        </w:tc>
-      </w:tr>
-      <w:tr>
-        <w:tc>
-          <w:tcPr>
-            <w:tcW w:type="dxa" w:w="5156"/>
-            <w:vAlign w:val="center"/>
-          </w:tcPr>
-          <w:p>
-            <w:pPr>
-              <w:spacing w:line="300" w:lineRule="auto" w:after="80"/>
-              <w:jc w:val="right"/>
-              <w:bidi w:val="1"/>
-            </w:pPr>
-            <w:r/>
-            <w:r>
-              <w:rPr>
-                <w:rFonts w:ascii="Arial" w:hAnsi="Arial" w:cs="Arial"/>
-                <w:b w:val="0"/>
-                <w:sz w:val="21"/>
-              </w:rPr>
-              <w:t>submission.csv</w:t>
-            </w:r>
-          </w:p>
-        </w:tc>
-        <w:tc>
-          <w:tcPr>
-            <w:tcW w:type="dxa" w:w="5156"/>
-            <w:vAlign w:val="center"/>
-          </w:tcPr>
-          <w:p>
-            <w:pPr>
-              <w:spacing w:line="300" w:lineRule="auto" w:after="80"/>
-              <w:jc w:val="right"/>
-              <w:bidi w:val="1"/>
-            </w:pPr>
-            <w:r/>
-            <w:r>
-              <w:rPr>
-                <w:rFonts w:ascii="Arial" w:hAnsi="Arial" w:cs="Arial"/>
-                <w:b w:val="0"/>
-                <w:sz w:val="21"/>
-              </w:rPr>
-              <w:t>ملف الرفع الأساسي</w:t>
-            </w:r>
-          </w:p>
-        </w:tc>
-      </w:tr>
-    </w:tbl>
-    <w:p/>
-    <w:p>
-      <w:pPr>
-        <w:spacing w:line="324" w:lineRule="auto" w:after="200"/>
-        <w:jc w:val="right"/>
-        <w:bidi w:val="1"/>
-      </w:pPr>
-      <w:r>
-        <w:rPr>
-          <w:rFonts w:ascii="Arial" w:hAnsi="Arial" w:cs="Arial"/>
-          <w:b/>
-          <w:color w:val="2E74B5"/>
-          <w:sz w:val="30"/>
-        </w:rPr>
-        <w:t>6. ملفات الرفع المرشحة</w:t>
+        <w:t>5. إدارة البيانات باستخدام DVC</w:t>
       </w:r>
     </w:p>
     <w:p>
@@ -1476,7 +831,99 @@
           <w:b w:val="0"/>
           <w:sz w:val="22"/>
         </w:rPr>
-        <w:t>بالإضافة إلى submission.csv، يولد الكود ملفات رفع منفصلة داخل classification_artifacts/model_submissions/. هذه الملفات تساعدنا على مقارنة المرشحين على Kaggle وربط كل ملف بتجربته الداخلية.</w:t>
+        <w:t>استخدمنا DVC لتتبع ملفات البيانات بدل رفع ملفات CSV الخام إلى GitHub. هذا يجعل المستودع أخف، ويعطي طريقة واضحة لأي عضو في الفريق ليسترجع نفس نسخة البيانات.</w:t>
+      </w:r>
+    </w:p>
+    <w:p>
+      <w:pPr>
+        <w:spacing w:line="324" w:lineRule="auto" w:after="160"/>
+        <w:jc w:val="right"/>
+        <w:bidi w:val="1"/>
+      </w:pPr>
+      <w:r>
+        <w:rPr>
+          <w:rFonts w:ascii="Arial" w:hAnsi="Arial" w:cs="Arial"/>
+          <w:b/>
+          <w:sz w:val="22"/>
+        </w:rPr>
+        <w:t>رابط مستودع GitHub:</w:t>
+      </w:r>
+    </w:p>
+    <w:p>
+      <w:pPr>
+        <w:spacing w:after="160"/>
+        <w:jc w:val="left"/>
+      </w:pPr>
+      <w:r>
+        <w:rPr>
+          <w:rFonts w:ascii="Arial" w:hAnsi="Arial" w:cs="Arial"/>
+          <w:b w:val="0"/>
+          <w:color w:val="282828"/>
+          <w:sz w:val="20"/>
+        </w:rPr>
+        <w:t>https://github.com/AhmadMurad10/FITE-Classification-Challenge</w:t>
+      </w:r>
+    </w:p>
+    <w:p>
+      <w:pPr>
+        <w:spacing w:line="324" w:lineRule="auto" w:after="160"/>
+        <w:jc w:val="right"/>
+        <w:bidi w:val="1"/>
+      </w:pPr>
+      <w:r>
+        <w:rPr>
+          <w:rFonts w:ascii="Arial" w:hAnsi="Arial" w:cs="Arial"/>
+          <w:b/>
+          <w:sz w:val="22"/>
+        </w:rPr>
+        <w:t>الـ DVC remote مضبوط على Google Drive:</w:t>
+      </w:r>
+    </w:p>
+    <w:p>
+      <w:pPr>
+        <w:spacing w:after="160"/>
+        <w:jc w:val="left"/>
+      </w:pPr>
+      <w:r>
+        <w:rPr>
+          <w:rFonts w:ascii="Arial" w:hAnsi="Arial" w:cs="Arial"/>
+          <w:b w:val="0"/>
+          <w:color w:val="282828"/>
+          <w:sz w:val="20"/>
+        </w:rPr>
+        <w:t>gdrive://12AfjjB_qMloHxg0oZsQ4fbWs3zYJCeAo</w:t>
+      </w:r>
+    </w:p>
+    <w:p>
+      <w:pPr>
+        <w:spacing w:line="324" w:lineRule="auto" w:after="160"/>
+        <w:jc w:val="right"/>
+        <w:bidi w:val="1"/>
+      </w:pPr>
+      <w:r>
+        <w:rPr>
+          <w:rFonts w:ascii="Arial" w:hAnsi="Arial" w:cs="Arial"/>
+          <w:b/>
+          <w:sz w:val="22"/>
+        </w:rPr>
+        <w:t>لاسترجاع البيانات على جهاز جديد:</w:t>
+      </w:r>
+    </w:p>
+    <w:p>
+      <w:pPr>
+        <w:spacing w:after="160"/>
+        <w:jc w:val="left"/>
+      </w:pPr>
+      <w:r>
+        <w:rPr>
+          <w:rFonts w:ascii="Arial" w:hAnsi="Arial" w:cs="Arial"/>
+          <w:b w:val="0"/>
+          <w:color w:val="282828"/>
+          <w:sz w:val="20"/>
+        </w:rPr>
+        <w:t>pip install -r requirements.txt</w:t>
+        <w:br/>
+        <w:t>dvc pull</w:t>
       </w:r>
     </w:p>
     <w:p>
@@ -1491,7 +938,7 @@
           <w:b w:val="0"/>
           <w:sz w:val="22"/>
         </w:rPr>
-        <w:t>من أهم الملفات: 00_reference_soft_voting_candidate.csv وملفات LightGBM وXGBoost وRandomForest وBagging.</w:t>
+        <w:t>يجب أن يكون لدى المستخدم صلاحية وصول إلى فولدر Google Drive قبل تنفيذ dvc pull.</w:t>
       </w:r>
     </w:p>
     <w:p>
@@ -1505,9 +952,9 @@
           <w:rFonts w:ascii="Arial" w:hAnsi="Arial" w:cs="Arial"/>
           <w:b/>
           <w:color w:val="2E74B5"/>
-          <w:sz w:val="30"/>
+          <w:sz w:val="28"/>
         </w:rPr>
-        <w:t>7. تتبع البيانات باستخدام DVC</w:t>
+        <w:t>6. خلاصة</w:t>
       </w:r>
     </w:p>
     <w:p>
@@ -1522,320 +969,12 @@
           <w:b w:val="0"/>
           <w:sz w:val="22"/>
         </w:rPr>
-        <w:t>تم استخدام DVC لتتبع ملفات البيانات بدون رفع ملفات CSV الخام إلى GitHub.</w:t>
-      </w:r>
-    </w:p>
-    <w:p>
-      <w:pPr>
-        <w:spacing w:line="324" w:lineRule="auto" w:after="160"/>
-        <w:jc w:val="right"/>
-        <w:bidi w:val="1"/>
-      </w:pPr>
-      <w:r>
-        <w:rPr>
-          <w:rFonts w:ascii="Arial" w:hAnsi="Arial" w:cs="Arial"/>
-          <w:b w:val="0"/>
-          <w:sz w:val="22"/>
-        </w:rPr>
-        <w:t>ملفات التتبع الموجودة في المستودع: train_data.csv.dvc وtest_data.csv.dvc وsample_submission.csv.dvc.</w:t>
-      </w:r>
-    </w:p>
-    <w:p>
-      <w:pPr>
-        <w:spacing w:line="324" w:lineRule="auto" w:after="160"/>
-        <w:jc w:val="right"/>
-        <w:bidi w:val="1"/>
-      </w:pPr>
-      <w:r>
-        <w:rPr>
-          <w:rFonts w:ascii="Arial" w:hAnsi="Arial" w:cs="Arial"/>
-          <w:b w:val="0"/>
-          <w:sz w:val="22"/>
-        </w:rPr>
-        <w:t>رابط مستودع GitHub: https://github.com/AhmadMurad10/FITE-Classification-Challenge</w:t>
-      </w:r>
-    </w:p>
-    <w:p>
-      <w:pPr>
-        <w:spacing w:line="324" w:lineRule="auto" w:after="160"/>
-        <w:jc w:val="right"/>
-        <w:bidi w:val="1"/>
-      </w:pPr>
-      <w:r>
-        <w:rPr>
-          <w:rFonts w:ascii="Arial" w:hAnsi="Arial" w:cs="Arial"/>
-          <w:b w:val="0"/>
-          <w:sz w:val="22"/>
-        </w:rPr>
-        <w:t>الـ DVC remote مضبوط على Google Drive: gdrive://12AfjjB_qMloHxg0oZsQ4fbWs3zYJCeAo</w:t>
-      </w:r>
-    </w:p>
-    <w:p>
-      <w:pPr>
-        <w:spacing w:line="324" w:lineRule="auto" w:after="160"/>
-        <w:jc w:val="right"/>
-        <w:bidi w:val="1"/>
-      </w:pPr>
-      <w:r>
-        <w:rPr>
-          <w:rFonts w:ascii="Arial" w:hAnsi="Arial" w:cs="Arial"/>
-          <w:b w:val="0"/>
-          <w:sz w:val="22"/>
-        </w:rPr>
-        <w:t>لاسترجاع البيانات على جهاز جديد: pip install -r requirements.txt ثم dvc pull. يجب إعطاء صلاحية الوصول إلى فولدر Google Drive قبل تشغيل dvc pull.</w:t>
-      </w:r>
-    </w:p>
-    <w:p>
-      <w:pPr>
-        <w:spacing w:line="324" w:lineRule="auto" w:after="200"/>
-        <w:jc w:val="right"/>
-        <w:bidi w:val="1"/>
-      </w:pPr>
-      <w:r>
-        <w:rPr>
-          <w:rFonts w:ascii="Arial" w:hAnsi="Arial" w:cs="Arial"/>
-          <w:b/>
-          <w:color w:val="2E74B5"/>
-          <w:sz w:val="30"/>
-        </w:rPr>
-        <w:t>8. الملفات المطلوبة للتسليم</w:t>
-      </w:r>
-    </w:p>
-    <w:tbl>
-      <w:tblPr>
-        <w:tblStyle w:val="TableGrid"/>
-        <w:tblW w:type="auto" w:w="0"/>
-        <w:jc w:val="center"/>
-        <w:tblLook w:firstColumn="1" w:firstRow="1" w:lastColumn="0" w:lastRow="0" w:noHBand="0" w:noVBand="1" w:val="04A0"/>
-      </w:tblPr>
-      <w:tblGrid>
-        <w:gridCol w:w="5156"/>
-        <w:gridCol w:w="5156"/>
-      </w:tblGrid>
-      <w:tr>
-        <w:tc>
-          <w:tcPr>
-            <w:tcW w:type="dxa" w:w="5156"/>
-            <w:shd w:fill="1F4E79"/>
-            <w:vAlign w:val="center"/>
-          </w:tcPr>
-          <w:p>
-            <w:pPr>
-              <w:spacing w:line="300" w:lineRule="auto" w:after="80"/>
-              <w:jc w:val="right"/>
-              <w:bidi w:val="1"/>
-            </w:pPr>
-            <w:r/>
-            <w:r>
-              <w:rPr>
-                <w:rFonts w:ascii="Arial" w:hAnsi="Arial" w:cs="Arial"/>
-                <w:b/>
-                <w:color w:val="FFFFFF"/>
-                <w:sz w:val="21"/>
-              </w:rPr>
-              <w:t>الملف</w:t>
-            </w:r>
-          </w:p>
-        </w:tc>
-        <w:tc>
-          <w:tcPr>
-            <w:tcW w:type="dxa" w:w="5156"/>
-            <w:shd w:fill="1F4E79"/>
-            <w:vAlign w:val="center"/>
-          </w:tcPr>
-          <w:p>
-            <w:pPr>
-              <w:spacing w:line="300" w:lineRule="auto" w:after="80"/>
-              <w:jc w:val="right"/>
-              <w:bidi w:val="1"/>
-            </w:pPr>
-            <w:r/>
-            <w:r>
-              <w:rPr>
-                <w:rFonts w:ascii="Arial" w:hAnsi="Arial" w:cs="Arial"/>
-                <w:b/>
-                <w:color w:val="FFFFFF"/>
-                <w:sz w:val="21"/>
-              </w:rPr>
-              <w:t>الغرض</w:t>
-            </w:r>
-          </w:p>
-        </w:tc>
-      </w:tr>
-      <w:tr>
-        <w:tc>
-          <w:tcPr>
-            <w:tcW w:type="dxa" w:w="5156"/>
-            <w:vAlign w:val="center"/>
-          </w:tcPr>
-          <w:p>
-            <w:pPr>
-              <w:spacing w:line="300" w:lineRule="auto" w:after="80"/>
-              <w:jc w:val="right"/>
-              <w:bidi w:val="1"/>
-            </w:pPr>
-            <w:r/>
-            <w:r>
-              <w:rPr>
-                <w:rFonts w:ascii="Arial" w:hAnsi="Arial" w:cs="Arial"/>
-                <w:b w:val="0"/>
-                <w:sz w:val="21"/>
-              </w:rPr>
-              <w:t>classification_pipeline.ipynb</w:t>
-            </w:r>
-          </w:p>
-        </w:tc>
-        <w:tc>
-          <w:tcPr>
-            <w:tcW w:type="dxa" w:w="5156"/>
-            <w:vAlign w:val="center"/>
-          </w:tcPr>
-          <w:p>
-            <w:pPr>
-              <w:spacing w:line="300" w:lineRule="auto" w:after="80"/>
-              <w:jc w:val="right"/>
-              <w:bidi w:val="1"/>
-            </w:pPr>
-            <w:r/>
-            <w:r>
-              <w:rPr>
-                <w:rFonts w:ascii="Arial" w:hAnsi="Arial" w:cs="Arial"/>
-                <w:b w:val="0"/>
-                <w:sz w:val="21"/>
-              </w:rPr>
-              <w:t>النوتبوك الرئيسي وفيه التحليل والتجارب والنتائج</w:t>
-            </w:r>
-          </w:p>
-        </w:tc>
-      </w:tr>
-      <w:tr>
-        <w:tc>
-          <w:tcPr>
-            <w:tcW w:type="dxa" w:w="5156"/>
-            <w:vAlign w:val="center"/>
-          </w:tcPr>
-          <w:p>
-            <w:pPr>
-              <w:spacing w:line="300" w:lineRule="auto" w:after="80"/>
-              <w:jc w:val="right"/>
-              <w:bidi w:val="1"/>
-            </w:pPr>
-            <w:r/>
-            <w:r>
-              <w:rPr>
-                <w:rFonts w:ascii="Arial" w:hAnsi="Arial" w:cs="Arial"/>
-                <w:b w:val="0"/>
-                <w:sz w:val="21"/>
-              </w:rPr>
-              <w:t>classification_pipeline.py</w:t>
-            </w:r>
-          </w:p>
-        </w:tc>
-        <w:tc>
-          <w:tcPr>
-            <w:tcW w:type="dxa" w:w="5156"/>
-            <w:vAlign w:val="center"/>
-          </w:tcPr>
-          <w:p>
-            <w:pPr>
-              <w:spacing w:line="300" w:lineRule="auto" w:after="80"/>
-              <w:jc w:val="right"/>
-              <w:bidi w:val="1"/>
-            </w:pPr>
-            <w:r/>
-            <w:r>
-              <w:rPr>
-                <w:rFonts w:ascii="Arial" w:hAnsi="Arial" w:cs="Arial"/>
-                <w:b w:val="0"/>
-                <w:sz w:val="21"/>
-              </w:rPr>
-              <w:t>نسخة Python قابلة للتشغيل المباشر وتعيد إنتاج المخرجات</w:t>
-            </w:r>
-          </w:p>
-        </w:tc>
-      </w:tr>
-      <w:tr>
-        <w:tc>
-          <w:tcPr>
-            <w:tcW w:type="dxa" w:w="5156"/>
-            <w:vAlign w:val="center"/>
-          </w:tcPr>
-          <w:p>
-            <w:pPr>
-              <w:spacing w:line="300" w:lineRule="auto" w:after="80"/>
-              <w:jc w:val="right"/>
-              <w:bidi w:val="1"/>
-            </w:pPr>
-            <w:r/>
-            <w:r>
-              <w:rPr>
-                <w:rFonts w:ascii="Arial" w:hAnsi="Arial" w:cs="Arial"/>
-                <w:b w:val="0"/>
-                <w:sz w:val="21"/>
-              </w:rPr>
-              <w:t>MLOps_Report.docx</w:t>
-            </w:r>
-          </w:p>
-        </w:tc>
-        <w:tc>
-          <w:tcPr>
-            <w:tcW w:type="dxa" w:w="5156"/>
-            <w:vAlign w:val="center"/>
-          </w:tcPr>
-          <w:p>
-            <w:pPr>
-              <w:spacing w:line="300" w:lineRule="auto" w:after="80"/>
-              <w:jc w:val="right"/>
-              <w:bidi w:val="1"/>
-            </w:pPr>
-            <w:r/>
-            <w:r>
-              <w:rPr>
-                <w:rFonts w:ascii="Arial" w:hAnsi="Arial" w:cs="Arial"/>
-                <w:b w:val="0"/>
-                <w:sz w:val="21"/>
-              </w:rPr>
-              <w:t>تقرير MLOps وفيه MLflow وDVC والتجارب والروابط</w:t>
-            </w:r>
-          </w:p>
-        </w:tc>
-      </w:tr>
-    </w:tbl>
-    <w:p/>
-    <w:p>
-      <w:pPr>
-        <w:spacing w:line="324" w:lineRule="auto" w:after="200"/>
-        <w:jc w:val="right"/>
-        <w:bidi w:val="1"/>
-      </w:pPr>
-      <w:r>
-        <w:rPr>
-          <w:rFonts w:ascii="Arial" w:hAnsi="Arial" w:cs="Arial"/>
-          <w:b/>
-          <w:color w:val="2E74B5"/>
-          <w:sz w:val="30"/>
-        </w:rPr>
-        <w:t>9. ملاحظة عن اختيار النموذج النهائي</w:t>
-      </w:r>
-    </w:p>
-    <w:p>
-      <w:pPr>
-        <w:spacing w:line="324" w:lineRule="auto" w:after="160"/>
-        <w:jc w:val="right"/>
-        <w:bidi w:val="1"/>
-      </w:pPr>
-      <w:r>
-        <w:rPr>
-          <w:rFonts w:ascii="Arial" w:hAnsi="Arial" w:cs="Arial"/>
-          <w:b w:val="0"/>
-          <w:sz w:val="22"/>
-        </w:rPr>
-        <w:t>بما أن نتائج النماذج متقاربة، لم نعتمد على رقم واحد فقط. قارنا النماذج باستخدام Macro F1، وفحصنا الثبات عبر أكثر من تقسيم، وحفظنا ملفات رفع متعددة للموديلات القوية. بهذه الطريقة يبقى الاختيار النهائي مبنياً على تقييم داخلي واضح.</w:t>
+        <w:t>تم بناء pipeline قابل للإعادة، وتسجيل التجارب باستخدام MLflow، وتتبع البيانات باستخدام DVC. كما تمت مقارنة عدة نماذج ومقاييس بدل الاعتماد على نتيجة واحدة. هذا يعطينا توثيقاً واضحاً لكيفية الوصول إلى النموذج النهائي، ويسهّل مراجعة التجارب أو إعادة تشغيلها لاحقاً.</w:t>
       </w:r>
     </w:p>
     <w:sectPr>
       <w:pgSz w:w="12240" w:h="15840"/>
-      <w:pgMar w:top="850" w:right="964" w:bottom="850" w:left="964" w:header="720" w:footer="720" w:gutter="0"/>
+      <w:pgMar w:top="850" w:right="850" w:bottom="850" w:left="850" w:header="720" w:footer="720" w:gutter="0"/>
       <w:cols w:space="720"/>
       <w:docGrid w:linePitch="360"/>
     </w:sectPr>

</xml_diff>

<commit_message>
Improve RTL formatting for MLOps report
</commit_message>
<xml_diff>
--- a/MLOps_Report.docx
+++ b/MLOps_Report.docx
@@ -4,7 +4,7 @@
   <w:body>
     <w:p>
       <w:pPr>
-        <w:spacing w:line="324" w:lineRule="auto" w:after="280"/>
+        <w:spacing w:line="348" w:lineRule="auto" w:after="320"/>
         <w:jc w:val="right"/>
         <w:bidi w:val="1"/>
       </w:pPr>
@@ -20,7 +20,7 @@
     </w:p>
     <w:p>
       <w:pPr>
-        <w:spacing w:line="324" w:lineRule="auto" w:after="200"/>
+        <w:spacing w:line="348" w:lineRule="auto" w:after="200"/>
         <w:jc w:val="right"/>
         <w:bidi w:val="1"/>
       </w:pPr>
@@ -36,7 +36,7 @@
     </w:p>
     <w:p>
       <w:pPr>
-        <w:spacing w:line="324" w:lineRule="auto" w:after="160"/>
+        <w:spacing w:line="348" w:lineRule="auto" w:after="160"/>
         <w:jc w:val="right"/>
         <w:bidi w:val="1"/>
       </w:pPr>
@@ -51,7 +51,7 @@
     </w:p>
     <w:p>
       <w:pPr>
-        <w:spacing w:line="324" w:lineRule="auto" w:after="160"/>
+        <w:spacing w:line="348" w:lineRule="auto" w:after="160"/>
         <w:jc w:val="right"/>
         <w:bidi w:val="1"/>
       </w:pPr>
@@ -66,7 +66,7 @@
     </w:p>
     <w:p>
       <w:pPr>
-        <w:spacing w:line="324" w:lineRule="auto" w:after="200"/>
+        <w:spacing w:line="348" w:lineRule="auto" w:after="200"/>
         <w:jc w:val="right"/>
         <w:bidi w:val="1"/>
       </w:pPr>
@@ -82,7 +82,7 @@
     </w:p>
     <w:p>
       <w:pPr>
-        <w:spacing w:line="324" w:lineRule="auto" w:after="160"/>
+        <w:spacing w:line="348" w:lineRule="auto" w:after="160"/>
         <w:jc w:val="right"/>
         <w:bidi w:val="1"/>
       </w:pPr>
@@ -97,7 +97,7 @@
     </w:p>
     <w:p>
       <w:pPr>
-        <w:spacing w:line="324" w:lineRule="auto" w:after="160"/>
+        <w:spacing w:line="348" w:lineRule="auto" w:after="160"/>
         <w:jc w:val="right"/>
         <w:bidi w:val="1"/>
       </w:pPr>
@@ -112,7 +112,7 @@
     </w:p>
     <w:p>
       <w:pPr>
-        <w:spacing w:line="324" w:lineRule="auto" w:after="200"/>
+        <w:spacing w:line="348" w:lineRule="auto" w:after="200"/>
         <w:jc w:val="right"/>
         <w:bidi w:val="1"/>
       </w:pPr>
@@ -128,7 +128,7 @@
     </w:p>
     <w:p>
       <w:pPr>
-        <w:spacing w:line="324" w:lineRule="auto" w:after="160"/>
+        <w:spacing w:line="348" w:lineRule="auto" w:after="160"/>
         <w:jc w:val="right"/>
         <w:bidi w:val="1"/>
       </w:pPr>
@@ -143,7 +143,7 @@
     </w:p>
     <w:p>
       <w:pPr>
-        <w:spacing w:line="324" w:lineRule="auto" w:after="160"/>
+        <w:spacing w:line="348" w:lineRule="auto" w:after="160"/>
         <w:jc w:val="right"/>
         <w:bidi w:val="1"/>
       </w:pPr>
@@ -158,7 +158,8 @@
     </w:p>
     <w:p>
       <w:pPr>
-        <w:spacing w:after="160"/>
+        <w:spacing w:before="40" w:after="200"/>
+        <w:ind w:left="142" w:right="142"/>
         <w:jc w:val="left"/>
       </w:pPr>
       <w:r>
@@ -173,7 +174,7 @@
     </w:p>
     <w:p>
       <w:pPr>
-        <w:spacing w:line="324" w:lineRule="auto" w:after="160"/>
+        <w:spacing w:line="348" w:lineRule="auto" w:after="160"/>
         <w:jc w:val="right"/>
         <w:bidi w:val="1"/>
       </w:pPr>
@@ -188,7 +189,8 @@
     </w:p>
     <w:p>
       <w:pPr>
-        <w:spacing w:after="160"/>
+        <w:spacing w:before="40" w:after="200"/>
+        <w:ind w:left="142" w:right="142"/>
         <w:jc w:val="left"/>
       </w:pPr>
       <w:r>
@@ -203,7 +205,7 @@
     </w:p>
     <w:p>
       <w:pPr>
-        <w:spacing w:line="324" w:lineRule="auto" w:after="160"/>
+        <w:spacing w:line="348" w:lineRule="auto" w:after="160"/>
         <w:jc w:val="right"/>
         <w:bidi w:val="1"/>
       </w:pPr>
@@ -257,8 +259,8 @@
     </w:p>
     <w:p>
       <w:pPr>
-        <w:spacing w:line="324" w:lineRule="auto" w:after="280"/>
-        <w:jc w:val="right"/>
+        <w:spacing w:line="348" w:lineRule="auto" w:after="280"/>
+        <w:jc w:val="center"/>
         <w:bidi w:val="1"/>
       </w:pPr>
       <w:r>
@@ -273,7 +275,7 @@
     </w:p>
     <w:p>
       <w:pPr>
-        <w:spacing w:line="324" w:lineRule="auto" w:after="160"/>
+        <w:spacing w:line="348" w:lineRule="auto" w:after="160"/>
         <w:jc w:val="right"/>
         <w:bidi w:val="1"/>
       </w:pPr>
@@ -327,8 +329,8 @@
     </w:p>
     <w:p>
       <w:pPr>
-        <w:spacing w:line="324" w:lineRule="auto" w:after="280"/>
-        <w:jc w:val="right"/>
+        <w:spacing w:line="348" w:lineRule="auto" w:after="280"/>
+        <w:jc w:val="center"/>
         <w:bidi w:val="1"/>
       </w:pPr>
       <w:r>
@@ -343,7 +345,7 @@
     </w:p>
     <w:p>
       <w:pPr>
-        <w:spacing w:line="324" w:lineRule="auto" w:after="200"/>
+        <w:spacing w:line="348" w:lineRule="auto" w:after="200"/>
         <w:jc w:val="right"/>
         <w:bidi w:val="1"/>
       </w:pPr>
@@ -363,6 +365,7 @@
         <w:tblW w:type="auto" w:w="0"/>
         <w:jc w:val="center"/>
         <w:tblLook w:firstColumn="1" w:firstRow="1" w:lastColumn="0" w:lastRow="0" w:noHBand="0" w:noVBand="1" w:val="04A0"/>
+        <w:bidiVisual w:val="1"/>
       </w:tblPr>
       <w:tblGrid>
         <w:gridCol w:w="5270"/>
@@ -374,10 +377,16 @@
             <w:tcW w:type="dxa" w:w="5270"/>
             <w:shd w:fill="1F4E79"/>
             <w:vAlign w:val="center"/>
+            <w:tcMar>
+              <w:top w:w="110" w:type="dxa"/>
+              <w:start w:w="110" w:type="dxa"/>
+              <w:bottom w:w="110" w:type="dxa"/>
+              <w:end w:w="110" w:type="dxa"/>
+            </w:tcMar>
           </w:tcPr>
           <w:p>
             <w:pPr>
-              <w:spacing w:line="300" w:lineRule="auto" w:after="100"/>
+              <w:spacing w:line="324" w:lineRule="auto" w:after="80"/>
               <w:jc w:val="right"/>
               <w:bidi w:val="1"/>
             </w:pPr>
@@ -398,10 +407,16 @@
             <w:tcW w:type="dxa" w:w="5270"/>
             <w:shd w:fill="1F4E79"/>
             <w:vAlign w:val="center"/>
+            <w:tcMar>
+              <w:top w:w="110" w:type="dxa"/>
+              <w:start w:w="110" w:type="dxa"/>
+              <w:bottom w:w="110" w:type="dxa"/>
+              <w:end w:w="110" w:type="dxa"/>
+            </w:tcMar>
           </w:tcPr>
           <w:p>
             <w:pPr>
-              <w:spacing w:line="300" w:lineRule="auto" w:after="100"/>
+              <w:spacing w:line="324" w:lineRule="auto" w:after="80"/>
               <w:jc w:val="right"/>
               <w:bidi w:val="1"/>
             </w:pPr>
@@ -423,10 +438,16 @@
           <w:tcPr>
             <w:tcW w:type="dxa" w:w="5270"/>
             <w:vAlign w:val="center"/>
+            <w:tcMar>
+              <w:top w:w="110" w:type="dxa"/>
+              <w:start w:w="110" w:type="dxa"/>
+              <w:bottom w:w="110" w:type="dxa"/>
+              <w:end w:w="110" w:type="dxa"/>
+            </w:tcMar>
           </w:tcPr>
           <w:p>
             <w:pPr>
-              <w:spacing w:line="300" w:lineRule="auto" w:after="100"/>
+              <w:spacing w:line="324" w:lineRule="auto" w:after="80"/>
               <w:jc w:val="right"/>
               <w:bidi w:val="1"/>
             </w:pPr>
@@ -445,10 +466,16 @@
           <w:tcPr>
             <w:tcW w:type="dxa" w:w="5270"/>
             <w:vAlign w:val="center"/>
+            <w:tcMar>
+              <w:top w:w="110" w:type="dxa"/>
+              <w:start w:w="110" w:type="dxa"/>
+              <w:bottom w:w="110" w:type="dxa"/>
+              <w:end w:w="110" w:type="dxa"/>
+            </w:tcMar>
           </w:tcPr>
           <w:p>
             <w:pPr>
-              <w:spacing w:line="300" w:lineRule="auto" w:after="100"/>
+              <w:spacing w:line="324" w:lineRule="auto" w:after="80"/>
               <w:jc w:val="right"/>
               <w:bidi w:val="1"/>
             </w:pPr>
@@ -469,10 +496,16 @@
           <w:tcPr>
             <w:tcW w:type="dxa" w:w="5270"/>
             <w:vAlign w:val="center"/>
+            <w:tcMar>
+              <w:top w:w="110" w:type="dxa"/>
+              <w:start w:w="110" w:type="dxa"/>
+              <w:bottom w:w="110" w:type="dxa"/>
+              <w:end w:w="110" w:type="dxa"/>
+            </w:tcMar>
           </w:tcPr>
           <w:p>
             <w:pPr>
-              <w:spacing w:line="300" w:lineRule="auto" w:after="100"/>
+              <w:spacing w:line="324" w:lineRule="auto" w:after="80"/>
               <w:jc w:val="right"/>
               <w:bidi w:val="1"/>
             </w:pPr>
@@ -491,10 +524,16 @@
           <w:tcPr>
             <w:tcW w:type="dxa" w:w="5270"/>
             <w:vAlign w:val="center"/>
+            <w:tcMar>
+              <w:top w:w="110" w:type="dxa"/>
+              <w:start w:w="110" w:type="dxa"/>
+              <w:bottom w:w="110" w:type="dxa"/>
+              <w:end w:w="110" w:type="dxa"/>
+            </w:tcMar>
           </w:tcPr>
           <w:p>
             <w:pPr>
-              <w:spacing w:line="300" w:lineRule="auto" w:after="100"/>
+              <w:spacing w:line="324" w:lineRule="auto" w:after="80"/>
               <w:jc w:val="right"/>
               <w:bidi w:val="1"/>
             </w:pPr>
@@ -515,10 +554,16 @@
           <w:tcPr>
             <w:tcW w:type="dxa" w:w="5270"/>
             <w:vAlign w:val="center"/>
+            <w:tcMar>
+              <w:top w:w="110" w:type="dxa"/>
+              <w:start w:w="110" w:type="dxa"/>
+              <w:bottom w:w="110" w:type="dxa"/>
+              <w:end w:w="110" w:type="dxa"/>
+            </w:tcMar>
           </w:tcPr>
           <w:p>
             <w:pPr>
-              <w:spacing w:line="300" w:lineRule="auto" w:after="100"/>
+              <w:spacing w:line="324" w:lineRule="auto" w:after="80"/>
               <w:jc w:val="right"/>
               <w:bidi w:val="1"/>
             </w:pPr>
@@ -537,10 +582,16 @@
           <w:tcPr>
             <w:tcW w:type="dxa" w:w="5270"/>
             <w:vAlign w:val="center"/>
+            <w:tcMar>
+              <w:top w:w="110" w:type="dxa"/>
+              <w:start w:w="110" w:type="dxa"/>
+              <w:bottom w:w="110" w:type="dxa"/>
+              <w:end w:w="110" w:type="dxa"/>
+            </w:tcMar>
           </w:tcPr>
           <w:p>
             <w:pPr>
-              <w:spacing w:line="300" w:lineRule="auto" w:after="100"/>
+              <w:spacing w:line="324" w:lineRule="auto" w:after="80"/>
               <w:jc w:val="right"/>
               <w:bidi w:val="1"/>
             </w:pPr>
@@ -561,10 +612,16 @@
           <w:tcPr>
             <w:tcW w:type="dxa" w:w="5270"/>
             <w:vAlign w:val="center"/>
+            <w:tcMar>
+              <w:top w:w="110" w:type="dxa"/>
+              <w:start w:w="110" w:type="dxa"/>
+              <w:bottom w:w="110" w:type="dxa"/>
+              <w:end w:w="110" w:type="dxa"/>
+            </w:tcMar>
           </w:tcPr>
           <w:p>
             <w:pPr>
-              <w:spacing w:line="300" w:lineRule="auto" w:after="100"/>
+              <w:spacing w:line="324" w:lineRule="auto" w:after="80"/>
               <w:jc w:val="right"/>
               <w:bidi w:val="1"/>
             </w:pPr>
@@ -583,10 +640,16 @@
           <w:tcPr>
             <w:tcW w:type="dxa" w:w="5270"/>
             <w:vAlign w:val="center"/>
+            <w:tcMar>
+              <w:top w:w="110" w:type="dxa"/>
+              <w:start w:w="110" w:type="dxa"/>
+              <w:bottom w:w="110" w:type="dxa"/>
+              <w:end w:w="110" w:type="dxa"/>
+            </w:tcMar>
           </w:tcPr>
           <w:p>
             <w:pPr>
-              <w:spacing w:line="300" w:lineRule="auto" w:after="100"/>
+              <w:spacing w:line="324" w:lineRule="auto" w:after="80"/>
               <w:jc w:val="right"/>
               <w:bidi w:val="1"/>
             </w:pPr>
@@ -607,10 +670,16 @@
           <w:tcPr>
             <w:tcW w:type="dxa" w:w="5270"/>
             <w:vAlign w:val="center"/>
+            <w:tcMar>
+              <w:top w:w="110" w:type="dxa"/>
+              <w:start w:w="110" w:type="dxa"/>
+              <w:bottom w:w="110" w:type="dxa"/>
+              <w:end w:w="110" w:type="dxa"/>
+            </w:tcMar>
           </w:tcPr>
           <w:p>
             <w:pPr>
-              <w:spacing w:line="300" w:lineRule="auto" w:after="100"/>
+              <w:spacing w:line="324" w:lineRule="auto" w:after="80"/>
               <w:jc w:val="right"/>
               <w:bidi w:val="1"/>
             </w:pPr>
@@ -629,10 +698,16 @@
           <w:tcPr>
             <w:tcW w:type="dxa" w:w="5270"/>
             <w:vAlign w:val="center"/>
+            <w:tcMar>
+              <w:top w:w="110" w:type="dxa"/>
+              <w:start w:w="110" w:type="dxa"/>
+              <w:bottom w:w="110" w:type="dxa"/>
+              <w:end w:w="110" w:type="dxa"/>
+            </w:tcMar>
           </w:tcPr>
           <w:p>
             <w:pPr>
-              <w:spacing w:line="300" w:lineRule="auto" w:after="100"/>
+              <w:spacing w:line="324" w:lineRule="auto" w:after="80"/>
               <w:jc w:val="right"/>
               <w:bidi w:val="1"/>
             </w:pPr>
@@ -653,10 +728,16 @@
           <w:tcPr>
             <w:tcW w:type="dxa" w:w="5270"/>
             <w:vAlign w:val="center"/>
+            <w:tcMar>
+              <w:top w:w="110" w:type="dxa"/>
+              <w:start w:w="110" w:type="dxa"/>
+              <w:bottom w:w="110" w:type="dxa"/>
+              <w:end w:w="110" w:type="dxa"/>
+            </w:tcMar>
           </w:tcPr>
           <w:p>
             <w:pPr>
-              <w:spacing w:line="300" w:lineRule="auto" w:after="100"/>
+              <w:spacing w:line="324" w:lineRule="auto" w:after="80"/>
               <w:jc w:val="right"/>
               <w:bidi w:val="1"/>
             </w:pPr>
@@ -675,10 +756,16 @@
           <w:tcPr>
             <w:tcW w:type="dxa" w:w="5270"/>
             <w:vAlign w:val="center"/>
+            <w:tcMar>
+              <w:top w:w="110" w:type="dxa"/>
+              <w:start w:w="110" w:type="dxa"/>
+              <w:bottom w:w="110" w:type="dxa"/>
+              <w:end w:w="110" w:type="dxa"/>
+            </w:tcMar>
           </w:tcPr>
           <w:p>
             <w:pPr>
-              <w:spacing w:line="300" w:lineRule="auto" w:after="100"/>
+              <w:spacing w:line="324" w:lineRule="auto" w:after="80"/>
               <w:jc w:val="right"/>
               <w:bidi w:val="1"/>
             </w:pPr>
@@ -699,10 +786,16 @@
           <w:tcPr>
             <w:tcW w:type="dxa" w:w="5270"/>
             <w:vAlign w:val="center"/>
+            <w:tcMar>
+              <w:top w:w="110" w:type="dxa"/>
+              <w:start w:w="110" w:type="dxa"/>
+              <w:bottom w:w="110" w:type="dxa"/>
+              <w:end w:w="110" w:type="dxa"/>
+            </w:tcMar>
           </w:tcPr>
           <w:p>
             <w:pPr>
-              <w:spacing w:line="300" w:lineRule="auto" w:after="100"/>
+              <w:spacing w:line="324" w:lineRule="auto" w:after="80"/>
               <w:jc w:val="right"/>
               <w:bidi w:val="1"/>
             </w:pPr>
@@ -721,10 +814,16 @@
           <w:tcPr>
             <w:tcW w:type="dxa" w:w="5270"/>
             <w:vAlign w:val="center"/>
+            <w:tcMar>
+              <w:top w:w="110" w:type="dxa"/>
+              <w:start w:w="110" w:type="dxa"/>
+              <w:bottom w:w="110" w:type="dxa"/>
+              <w:end w:w="110" w:type="dxa"/>
+            </w:tcMar>
           </w:tcPr>
           <w:p>
             <w:pPr>
-              <w:spacing w:line="300" w:lineRule="auto" w:after="100"/>
+              <w:spacing w:line="324" w:lineRule="auto" w:after="80"/>
               <w:jc w:val="right"/>
               <w:bidi w:val="1"/>
             </w:pPr>
@@ -745,10 +844,16 @@
           <w:tcPr>
             <w:tcW w:type="dxa" w:w="5270"/>
             <w:vAlign w:val="center"/>
+            <w:tcMar>
+              <w:top w:w="110" w:type="dxa"/>
+              <w:start w:w="110" w:type="dxa"/>
+              <w:bottom w:w="110" w:type="dxa"/>
+              <w:end w:w="110" w:type="dxa"/>
+            </w:tcMar>
           </w:tcPr>
           <w:p>
             <w:pPr>
-              <w:spacing w:line="300" w:lineRule="auto" w:after="100"/>
+              <w:spacing w:line="324" w:lineRule="auto" w:after="80"/>
               <w:jc w:val="right"/>
               <w:bidi w:val="1"/>
             </w:pPr>
@@ -767,10 +872,16 @@
           <w:tcPr>
             <w:tcW w:type="dxa" w:w="5270"/>
             <w:vAlign w:val="center"/>
+            <w:tcMar>
+              <w:top w:w="110" w:type="dxa"/>
+              <w:start w:w="110" w:type="dxa"/>
+              <w:bottom w:w="110" w:type="dxa"/>
+              <w:end w:w="110" w:type="dxa"/>
+            </w:tcMar>
           </w:tcPr>
           <w:p>
             <w:pPr>
-              <w:spacing w:line="300" w:lineRule="auto" w:after="100"/>
+              <w:spacing w:line="324" w:lineRule="auto" w:after="80"/>
               <w:jc w:val="right"/>
               <w:bidi w:val="1"/>
             </w:pPr>
@@ -790,7 +901,7 @@
     <w:p/>
     <w:p>
       <w:pPr>
-        <w:spacing w:line="324" w:lineRule="auto" w:after="160"/>
+        <w:spacing w:line="348" w:lineRule="auto" w:after="160"/>
         <w:jc w:val="right"/>
         <w:bidi w:val="1"/>
       </w:pPr>
@@ -805,7 +916,7 @@
     </w:p>
     <w:p>
       <w:pPr>
-        <w:spacing w:line="324" w:lineRule="auto" w:after="200"/>
+        <w:spacing w:line="348" w:lineRule="auto" w:after="200"/>
         <w:jc w:val="right"/>
         <w:bidi w:val="1"/>
       </w:pPr>
@@ -821,7 +932,7 @@
     </w:p>
     <w:p>
       <w:pPr>
-        <w:spacing w:line="324" w:lineRule="auto" w:after="160"/>
+        <w:spacing w:line="348" w:lineRule="auto" w:after="160"/>
         <w:jc w:val="right"/>
         <w:bidi w:val="1"/>
       </w:pPr>
@@ -836,7 +947,7 @@
     </w:p>
     <w:p>
       <w:pPr>
-        <w:spacing w:line="324" w:lineRule="auto" w:after="160"/>
+        <w:spacing w:line="348" w:lineRule="auto" w:after="160"/>
         <w:jc w:val="right"/>
         <w:bidi w:val="1"/>
       </w:pPr>
@@ -851,7 +962,8 @@
     </w:p>
     <w:p>
       <w:pPr>
-        <w:spacing w:after="160"/>
+        <w:spacing w:before="40" w:after="200"/>
+        <w:ind w:left="142" w:right="142"/>
         <w:jc w:val="left"/>
       </w:pPr>
       <w:r>
@@ -866,7 +978,7 @@
     </w:p>
     <w:p>
       <w:pPr>
-        <w:spacing w:line="324" w:lineRule="auto" w:after="160"/>
+        <w:spacing w:line="348" w:lineRule="auto" w:after="160"/>
         <w:jc w:val="right"/>
         <w:bidi w:val="1"/>
       </w:pPr>
@@ -881,7 +993,8 @@
     </w:p>
     <w:p>
       <w:pPr>
-        <w:spacing w:after="160"/>
+        <w:spacing w:before="40" w:after="200"/>
+        <w:ind w:left="142" w:right="142"/>
         <w:jc w:val="left"/>
       </w:pPr>
       <w:r>
@@ -896,7 +1009,7 @@
     </w:p>
     <w:p>
       <w:pPr>
-        <w:spacing w:line="324" w:lineRule="auto" w:after="160"/>
+        <w:spacing w:line="348" w:lineRule="auto" w:after="160"/>
         <w:jc w:val="right"/>
         <w:bidi w:val="1"/>
       </w:pPr>
@@ -911,7 +1024,8 @@
     </w:p>
     <w:p>
       <w:pPr>
-        <w:spacing w:after="160"/>
+        <w:spacing w:before="40" w:after="200"/>
+        <w:ind w:left="142" w:right="142"/>
         <w:jc w:val="left"/>
       </w:pPr>
       <w:r>
@@ -922,13 +1036,23 @@
           <w:sz w:val="20"/>
         </w:rPr>
         <w:t>pip install -r requirements.txt</w:t>
+      </w:r>
+      <w:r>
         <w:br/>
+      </w:r>
+      <w:r>
+        <w:rPr>
+          <w:rFonts w:ascii="Arial" w:hAnsi="Arial" w:cs="Arial"/>
+          <w:b w:val="0"/>
+          <w:color w:val="282828"/>
+          <w:sz w:val="20"/>
+        </w:rPr>
         <w:t>dvc pull</w:t>
       </w:r>
     </w:p>
     <w:p>
       <w:pPr>
-        <w:spacing w:line="324" w:lineRule="auto" w:after="160"/>
+        <w:spacing w:line="348" w:lineRule="auto" w:after="160"/>
         <w:jc w:val="right"/>
         <w:bidi w:val="1"/>
       </w:pPr>
@@ -943,7 +1067,7 @@
     </w:p>
     <w:p>
       <w:pPr>
-        <w:spacing w:line="324" w:lineRule="auto" w:after="200"/>
+        <w:spacing w:line="348" w:lineRule="auto" w:after="200"/>
         <w:jc w:val="right"/>
         <w:bidi w:val="1"/>
       </w:pPr>
@@ -959,7 +1083,7 @@
     </w:p>
     <w:p>
       <w:pPr>
-        <w:spacing w:line="324" w:lineRule="auto" w:after="160"/>
+        <w:spacing w:line="348" w:lineRule="auto" w:after="160"/>
         <w:jc w:val="right"/>
         <w:bidi w:val="1"/>
       </w:pPr>
@@ -974,7 +1098,7 @@
     </w:p>
     <w:sectPr>
       <w:pgSz w:w="12240" w:h="15840"/>
-      <w:pgMar w:top="850" w:right="850" w:bottom="850" w:left="850" w:header="720" w:footer="720" w:gutter="0"/>
+      <w:pgMar w:top="907" w:right="850" w:bottom="907" w:left="850" w:header="720" w:footer="720" w:gutter="0"/>
       <w:cols w:space="720"/>
       <w:docGrid w:linePitch="360"/>
     </w:sectPr>

</xml_diff>

<commit_message>
Force RTL layout in MLOps report
</commit_message>
<xml_diff>
--- a/MLOps_Report.docx
+++ b/MLOps_Report.docx
@@ -4,169 +4,187 @@
   <w:body>
     <w:p>
       <w:pPr>
-        <w:spacing w:line="348" w:lineRule="auto" w:after="320"/>
+        <w:spacing w:line="360" w:lineRule="auto" w:after="360"/>
         <w:jc w:val="right"/>
         <w:bidi w:val="1"/>
       </w:pPr>
       <w:r>
         <w:rPr>
-          <w:rFonts w:ascii="Arial" w:hAnsi="Arial" w:cs="Arial"/>
+          <w:rFonts w:ascii="Tahoma" w:hAnsi="Tahoma" w:cs="Tahoma"/>
           <w:b/>
           <w:color w:val="1F4E79"/>
           <w:sz w:val="36"/>
+          <w:rtl w:val="1"/>
+          <w:lang w:val="ar-SA" w:bidi="ar-SA"/>
         </w:rPr>
         <w:t>تقرير MLOps - FITE Classification Challenge</w:t>
       </w:r>
     </w:p>
     <w:p>
       <w:pPr>
-        <w:spacing w:line="348" w:lineRule="auto" w:after="200"/>
+        <w:spacing w:line="360" w:lineRule="auto" w:after="200"/>
         <w:jc w:val="right"/>
         <w:bidi w:val="1"/>
       </w:pPr>
       <w:r>
         <w:rPr>
-          <w:rFonts w:ascii="Arial" w:hAnsi="Arial" w:cs="Arial"/>
+          <w:rFonts w:ascii="Tahoma" w:hAnsi="Tahoma" w:cs="Tahoma"/>
           <w:b/>
           <w:color w:val="2E74B5"/>
           <w:sz w:val="28"/>
+          <w:rtl w:val="1"/>
+          <w:lang w:val="ar-SA" w:bidi="ar-SA"/>
         </w:rPr>
         <w:t>1. فكرة المشروع</w:t>
       </w:r>
     </w:p>
     <w:p>
       <w:pPr>
-        <w:spacing w:line="348" w:lineRule="auto" w:after="160"/>
+        <w:spacing w:line="360" w:lineRule="auto" w:after="160"/>
         <w:jc w:val="right"/>
         <w:bidi w:val="1"/>
       </w:pPr>
       <w:r>
         <w:rPr>
-          <w:rFonts w:ascii="Arial" w:hAnsi="Arial" w:cs="Arial"/>
+          <w:rFonts w:ascii="Tahoma" w:hAnsi="Tahoma" w:cs="Tahoma"/>
           <w:b w:val="0"/>
           <w:sz w:val="22"/>
+          <w:rtl w:val="1"/>
+          <w:lang w:val="ar-SA" w:bidi="ar-SA"/>
         </w:rPr>
         <w:t>المشروع عبارة عن مسألة تصنيف متعدد الكلاسات على بيانات جدولية مجهولة المعنى. بما أن أسماء الخصائص لا تحمل معنى واضحاً، كان التركيز على بناء خط تدريب قابل للإعادة، وتجربة أكثر من نموذج، ثم توثيق النتائج بطريقة تسمح بمقارنة التجارب بدل الاعتماد على تجربة واحدة.</w:t>
       </w:r>
     </w:p>
     <w:p>
       <w:pPr>
-        <w:spacing w:line="348" w:lineRule="auto" w:after="160"/>
+        <w:spacing w:line="360" w:lineRule="auto" w:after="160"/>
         <w:jc w:val="right"/>
         <w:bidi w:val="1"/>
       </w:pPr>
       <w:r>
         <w:rPr>
-          <w:rFonts w:ascii="Arial" w:hAnsi="Arial" w:cs="Arial"/>
+          <w:rFonts w:ascii="Tahoma" w:hAnsi="Tahoma" w:cs="Tahoma"/>
           <w:b w:val="0"/>
           <w:sz w:val="22"/>
+          <w:rtl w:val="1"/>
+          <w:lang w:val="ar-SA" w:bidi="ar-SA"/>
         </w:rPr>
         <w:t>استخدمنا Macro F1 كمقياس أساسي لأن توزيع الكلاسات غير متوازن. هذا المقياس يعطينا صورة أوضح عن أداء النموذج على كل كلاس، وليس فقط على الكلاس الأكبر.</w:t>
       </w:r>
     </w:p>
     <w:p>
       <w:pPr>
-        <w:spacing w:line="348" w:lineRule="auto" w:after="200"/>
+        <w:spacing w:line="360" w:lineRule="auto" w:after="200"/>
         <w:jc w:val="right"/>
         <w:bidi w:val="1"/>
       </w:pPr>
       <w:r>
         <w:rPr>
-          <w:rFonts w:ascii="Arial" w:hAnsi="Arial" w:cs="Arial"/>
+          <w:rFonts w:ascii="Tahoma" w:hAnsi="Tahoma" w:cs="Tahoma"/>
           <w:b/>
           <w:color w:val="2E74B5"/>
           <w:sz w:val="28"/>
+          <w:rtl w:val="1"/>
+          <w:lang w:val="ar-SA" w:bidi="ar-SA"/>
         </w:rPr>
         <w:t>2. منهجية التقييم</w:t>
       </w:r>
     </w:p>
     <w:p>
       <w:pPr>
-        <w:spacing w:line="348" w:lineRule="auto" w:after="160"/>
+        <w:spacing w:line="360" w:lineRule="auto" w:after="160"/>
         <w:jc w:val="right"/>
         <w:bidi w:val="1"/>
       </w:pPr>
       <w:r>
         <w:rPr>
-          <w:rFonts w:ascii="Arial" w:hAnsi="Arial" w:cs="Arial"/>
+          <w:rFonts w:ascii="Tahoma" w:hAnsi="Tahoma" w:cs="Tahoma"/>
           <w:b w:val="0"/>
           <w:sz w:val="22"/>
+          <w:rtl w:val="1"/>
+          <w:lang w:val="ar-SA" w:bidi="ar-SA"/>
         </w:rPr>
         <w:t>اعتمدنا على StratifiedKFold حتى تبقى نسب الكلاسات متقاربة داخل كل fold. لكل نموذج سجلنا Accuracy وBalanced Accuracy وMacro F1، بالإضافة إلى اسم النموذج والإعدادات الأساسية.</w:t>
       </w:r>
     </w:p>
     <w:p>
       <w:pPr>
-        <w:spacing w:line="348" w:lineRule="auto" w:after="160"/>
+        <w:spacing w:line="360" w:lineRule="auto" w:after="160"/>
         <w:jc w:val="right"/>
         <w:bidi w:val="1"/>
       </w:pPr>
       <w:r>
         <w:rPr>
-          <w:rFonts w:ascii="Arial" w:hAnsi="Arial" w:cs="Arial"/>
+          <w:rFonts w:ascii="Tahoma" w:hAnsi="Tahoma" w:cs="Tahoma"/>
           <w:b w:val="0"/>
           <w:sz w:val="22"/>
+          <w:rtl w:val="1"/>
+          <w:lang w:val="ar-SA" w:bidi="ar-SA"/>
         </w:rPr>
         <w:t>بهذا الشكل أصبح القرار مبنياً على مقارنة داخلية واضحة بين النماذج، وليس على رقم واحد فقط.</w:t>
       </w:r>
     </w:p>
     <w:p>
       <w:pPr>
-        <w:spacing w:line="348" w:lineRule="auto" w:after="200"/>
+        <w:spacing w:line="360" w:lineRule="auto" w:after="200"/>
         <w:jc w:val="right"/>
         <w:bidi w:val="1"/>
       </w:pPr>
       <w:r>
         <w:rPr>
-          <w:rFonts w:ascii="Arial" w:hAnsi="Arial" w:cs="Arial"/>
+          <w:rFonts w:ascii="Tahoma" w:hAnsi="Tahoma" w:cs="Tahoma"/>
           <w:b/>
           <w:color w:val="2E74B5"/>
           <w:sz w:val="28"/>
+          <w:rtl w:val="1"/>
+          <w:lang w:val="ar-SA" w:bidi="ar-SA"/>
         </w:rPr>
         <w:t>3. تتبع التجارب باستخدام MLflow</w:t>
       </w:r>
     </w:p>
     <w:p>
       <w:pPr>
-        <w:spacing w:line="348" w:lineRule="auto" w:after="160"/>
+        <w:spacing w:line="360" w:lineRule="auto" w:after="160"/>
         <w:jc w:val="right"/>
         <w:bidi w:val="1"/>
       </w:pPr>
       <w:r>
         <w:rPr>
-          <w:rFonts w:ascii="Arial" w:hAnsi="Arial" w:cs="Arial"/>
+          <w:rFonts w:ascii="Tahoma" w:hAnsi="Tahoma" w:cs="Tahoma"/>
           <w:b w:val="0"/>
           <w:sz w:val="22"/>
+          <w:rtl w:val="1"/>
+          <w:lang w:val="ar-SA" w:bidi="ar-SA"/>
         </w:rPr>
         <w:t>تم دمج MLflow داخل كود التدريب. كل تجربة يتم تسجيلها كـ run مستقل يحتوي على اسم النموذج، الهدف من التجربة، المقاييس، وبعض الملفات الناتجة عند الحاجة.</w:t>
       </w:r>
     </w:p>
     <w:p>
       <w:pPr>
-        <w:spacing w:line="348" w:lineRule="auto" w:after="160"/>
+        <w:spacing w:line="360" w:lineRule="auto" w:after="160"/>
         <w:jc w:val="right"/>
         <w:bidi w:val="1"/>
       </w:pPr>
       <w:r>
         <w:rPr>
-          <w:rFonts w:ascii="Arial" w:hAnsi="Arial" w:cs="Arial"/>
+          <w:rFonts w:ascii="Tahoma" w:hAnsi="Tahoma" w:cs="Tahoma"/>
           <w:b/>
           <w:sz w:val="22"/>
+          <w:rtl w:val="1"/>
+          <w:lang w:val="ar-SA" w:bidi="ar-SA"/>
         </w:rPr>
         <w:t>لتشغيل واجهة MLflow محلياً:</w:t>
       </w:r>
     </w:p>
     <w:p>
       <w:pPr>
-        <w:spacing w:before="40" w:after="200"/>
-        <w:ind w:left="142" w:right="142"/>
+        <w:spacing w:after="200"/>
         <w:jc w:val="left"/>
       </w:pPr>
       <w:r>
         <w:rPr>
-          <w:rFonts w:ascii="Arial" w:hAnsi="Arial" w:cs="Arial"/>
-          <w:b w:val="0"/>
-          <w:color w:val="282828"/>
+          <w:rFonts w:ascii="Consolas" w:hAnsi="Consolas"/>
+          <w:color w:val="323232"/>
           <w:sz w:val="20"/>
         </w:rPr>
         <w:t>mlflow ui --backend-store-uri sqlite:///mlflow.db</w:t>
@@ -174,30 +192,30 @@
     </w:p>
     <w:p>
       <w:pPr>
-        <w:spacing w:line="348" w:lineRule="auto" w:after="160"/>
+        <w:spacing w:line="360" w:lineRule="auto" w:after="160"/>
         <w:jc w:val="right"/>
         <w:bidi w:val="1"/>
       </w:pPr>
       <w:r>
         <w:rPr>
-          <w:rFonts w:ascii="Arial" w:hAnsi="Arial" w:cs="Arial"/>
+          <w:rFonts w:ascii="Tahoma" w:hAnsi="Tahoma" w:cs="Tahoma"/>
           <w:b/>
           <w:sz w:val="22"/>
+          <w:rtl w:val="1"/>
+          <w:lang w:val="ar-SA" w:bidi="ar-SA"/>
         </w:rPr>
         <w:t>ثم فتح الرابط:</w:t>
       </w:r>
     </w:p>
     <w:p>
       <w:pPr>
-        <w:spacing w:before="40" w:after="200"/>
-        <w:ind w:left="142" w:right="142"/>
+        <w:spacing w:after="200"/>
         <w:jc w:val="left"/>
       </w:pPr>
       <w:r>
         <w:rPr>
-          <w:rFonts w:ascii="Arial" w:hAnsi="Arial" w:cs="Arial"/>
-          <w:b w:val="0"/>
-          <w:color w:val="282828"/>
+          <w:rFonts w:ascii="Consolas" w:hAnsi="Consolas"/>
+          <w:color w:val="323232"/>
           <w:sz w:val="20"/>
         </w:rPr>
         <w:t>http://127.0.0.1:5000</w:t>
@@ -205,15 +223,17 @@
     </w:p>
     <w:p>
       <w:pPr>
-        <w:spacing w:line="348" w:lineRule="auto" w:after="160"/>
+        <w:spacing w:line="360" w:lineRule="auto" w:after="160"/>
         <w:jc w:val="right"/>
         <w:bidi w:val="1"/>
       </w:pPr>
       <w:r>
         <w:rPr>
-          <w:rFonts w:ascii="Arial" w:hAnsi="Arial" w:cs="Arial"/>
+          <w:rFonts w:ascii="Tahoma" w:hAnsi="Tahoma" w:cs="Tahoma"/>
           <w:b w:val="0"/>
           <w:sz w:val="22"/>
+          <w:rtl w:val="1"/>
+          <w:lang w:val="ar-SA" w:bidi="ar-SA"/>
         </w:rPr>
         <w:t>الصورة التالية تعرض مجموعة من التجارب المسجلة، مع مقاييس المقارنة الأساسية مثل accuracy_mean وbalanced_accuracy_mean وf1_macro_mean.</w:t>
       </w:r>
@@ -259,31 +279,35 @@
     </w:p>
     <w:p>
       <w:pPr>
-        <w:spacing w:line="348" w:lineRule="auto" w:after="280"/>
+        <w:spacing w:line="360" w:lineRule="auto" w:after="160"/>
         <w:jc w:val="center"/>
         <w:bidi w:val="1"/>
       </w:pPr>
       <w:r>
         <w:rPr>
-          <w:rFonts w:ascii="Arial" w:hAnsi="Arial" w:cs="Arial"/>
+          <w:rFonts w:ascii="Tahoma" w:hAnsi="Tahoma" w:cs="Tahoma"/>
           <w:b/>
-          <w:color w:val="595959"/>
+          <w:color w:val="5A5A5A"/>
           <w:sz w:val="20"/>
+          <w:rtl w:val="1"/>
+          <w:lang w:val="ar-SA" w:bidi="ar-SA"/>
         </w:rPr>
         <w:t>صورة 1: جدول MLflow لتجارب النماذج مع المقاييس الأساسية.</w:t>
       </w:r>
     </w:p>
     <w:p>
       <w:pPr>
-        <w:spacing w:line="348" w:lineRule="auto" w:after="160"/>
+        <w:spacing w:line="360" w:lineRule="auto" w:after="160"/>
         <w:jc w:val="right"/>
         <w:bidi w:val="1"/>
       </w:pPr>
       <w:r>
         <w:rPr>
-          <w:rFonts w:ascii="Arial" w:hAnsi="Arial" w:cs="Arial"/>
+          <w:rFonts w:ascii="Tahoma" w:hAnsi="Tahoma" w:cs="Tahoma"/>
           <w:b w:val="0"/>
           <w:sz w:val="22"/>
+          <w:rtl w:val="1"/>
+          <w:lang w:val="ar-SA" w:bidi="ar-SA"/>
         </w:rPr>
         <w:t>الصورة التالية تعرض تجارب الـ ensemble والفحوصات الإضافية مثل final_ensemble وreference_soft_voting_candidate، وفيها تظهر مقاييس oof_accuracy وoof_f1_macro.</w:t>
       </w:r>
@@ -329,32 +353,36 @@
     </w:p>
     <w:p>
       <w:pPr>
-        <w:spacing w:line="348" w:lineRule="auto" w:after="280"/>
+        <w:spacing w:line="360" w:lineRule="auto" w:after="160"/>
         <w:jc w:val="center"/>
         <w:bidi w:val="1"/>
       </w:pPr>
       <w:r>
         <w:rPr>
-          <w:rFonts w:ascii="Arial" w:hAnsi="Arial" w:cs="Arial"/>
+          <w:rFonts w:ascii="Tahoma" w:hAnsi="Tahoma" w:cs="Tahoma"/>
           <w:b/>
-          <w:color w:val="595959"/>
+          <w:color w:val="5A5A5A"/>
           <w:sz w:val="20"/>
+          <w:rtl w:val="1"/>
+          <w:lang w:val="ar-SA" w:bidi="ar-SA"/>
         </w:rPr>
         <w:t>صورة 2: جدول MLflow لتجارب الـ ensemble والفحوصات الإضافية.</w:t>
       </w:r>
     </w:p>
     <w:p>
       <w:pPr>
-        <w:spacing w:line="348" w:lineRule="auto" w:after="200"/>
+        <w:spacing w:line="360" w:lineRule="auto" w:after="200"/>
         <w:jc w:val="right"/>
         <w:bidi w:val="1"/>
       </w:pPr>
       <w:r>
         <w:rPr>
-          <w:rFonts w:ascii="Arial" w:hAnsi="Arial" w:cs="Arial"/>
+          <w:rFonts w:ascii="Tahoma" w:hAnsi="Tahoma" w:cs="Tahoma"/>
           <w:b/>
           <w:color w:val="2E74B5"/>
           <w:sz w:val="28"/>
+          <w:rtl w:val="1"/>
+          <w:lang w:val="ar-SA" w:bidi="ar-SA"/>
         </w:rPr>
         <w:t>4. التجارب التي تمت مقارنتها</w:t>
       </w:r>
@@ -363,7 +391,7 @@
       <w:tblPr>
         <w:tblStyle w:val="TableGrid"/>
         <w:tblW w:type="auto" w:w="0"/>
-        <w:jc w:val="center"/>
+        <w:jc w:val="right"/>
         <w:tblLook w:firstColumn="1" w:firstRow="1" w:lastColumn="0" w:lastRow="0" w:noHBand="0" w:noVBand="1" w:val="04A0"/>
         <w:bidiVisual w:val="1"/>
       </w:tblPr>
@@ -378,10 +406,10 @@
             <w:shd w:fill="1F4E79"/>
             <w:vAlign w:val="center"/>
             <w:tcMar>
-              <w:top w:w="110" w:type="dxa"/>
-              <w:start w:w="110" w:type="dxa"/>
-              <w:bottom w:w="110" w:type="dxa"/>
-              <w:end w:w="110" w:type="dxa"/>
+              <w:top w:w="120" w:type="dxa"/>
+              <w:start w:w="120" w:type="dxa"/>
+              <w:bottom w:w="120" w:type="dxa"/>
+              <w:end w:w="120" w:type="dxa"/>
             </w:tcMar>
           </w:tcPr>
           <w:p>
@@ -393,10 +421,12 @@
             <w:r/>
             <w:r>
               <w:rPr>
-                <w:rFonts w:ascii="Arial" w:hAnsi="Arial" w:cs="Arial"/>
+                <w:rFonts w:ascii="Tahoma" w:hAnsi="Tahoma" w:cs="Tahoma"/>
                 <w:b/>
                 <w:color w:val="FFFFFF"/>
                 <w:sz w:val="21"/>
+                <w:rtl w:val="1"/>
+                <w:lang w:val="ar-SA" w:bidi="ar-SA"/>
               </w:rPr>
               <w:t>نوع التجربة</w:t>
             </w:r>
@@ -408,10 +438,10 @@
             <w:shd w:fill="1F4E79"/>
             <w:vAlign w:val="center"/>
             <w:tcMar>
-              <w:top w:w="110" w:type="dxa"/>
-              <w:start w:w="110" w:type="dxa"/>
-              <w:bottom w:w="110" w:type="dxa"/>
-              <w:end w:w="110" w:type="dxa"/>
+              <w:top w:w="120" w:type="dxa"/>
+              <w:start w:w="120" w:type="dxa"/>
+              <w:bottom w:w="120" w:type="dxa"/>
+              <w:end w:w="120" w:type="dxa"/>
             </w:tcMar>
           </w:tcPr>
           <w:p>
@@ -423,10 +453,12 @@
             <w:r/>
             <w:r>
               <w:rPr>
-                <w:rFonts w:ascii="Arial" w:hAnsi="Arial" w:cs="Arial"/>
+                <w:rFonts w:ascii="Tahoma" w:hAnsi="Tahoma" w:cs="Tahoma"/>
                 <w:b/>
                 <w:color w:val="FFFFFF"/>
                 <w:sz w:val="21"/>
+                <w:rtl w:val="1"/>
+                <w:lang w:val="ar-SA" w:bidi="ar-SA"/>
               </w:rPr>
               <w:t>الهدف</w:t>
             </w:r>
@@ -439,10 +471,10 @@
             <w:tcW w:type="dxa" w:w="5270"/>
             <w:vAlign w:val="center"/>
             <w:tcMar>
-              <w:top w:w="110" w:type="dxa"/>
-              <w:start w:w="110" w:type="dxa"/>
-              <w:bottom w:w="110" w:type="dxa"/>
-              <w:end w:w="110" w:type="dxa"/>
+              <w:top w:w="120" w:type="dxa"/>
+              <w:start w:w="120" w:type="dxa"/>
+              <w:bottom w:w="120" w:type="dxa"/>
+              <w:end w:w="120" w:type="dxa"/>
             </w:tcMar>
           </w:tcPr>
           <w:p>
@@ -454,9 +486,11 @@
             <w:r/>
             <w:r>
               <w:rPr>
-                <w:rFonts w:ascii="Arial" w:hAnsi="Arial" w:cs="Arial"/>
+                <w:rFonts w:ascii="Tahoma" w:hAnsi="Tahoma" w:cs="Tahoma"/>
                 <w:b w:val="0"/>
                 <w:sz w:val="21"/>
+                <w:rtl w:val="1"/>
+                <w:lang w:val="ar-SA" w:bidi="ar-SA"/>
               </w:rPr>
               <w:t>Decision Tree و Bagging</w:t>
             </w:r>
@@ -467,10 +501,10 @@
             <w:tcW w:type="dxa" w:w="5270"/>
             <w:vAlign w:val="center"/>
             <w:tcMar>
-              <w:top w:w="110" w:type="dxa"/>
-              <w:start w:w="110" w:type="dxa"/>
-              <w:bottom w:w="110" w:type="dxa"/>
-              <w:end w:w="110" w:type="dxa"/>
+              <w:top w:w="120" w:type="dxa"/>
+              <w:start w:w="120" w:type="dxa"/>
+              <w:bottom w:w="120" w:type="dxa"/>
+              <w:end w:w="120" w:type="dxa"/>
             </w:tcMar>
           </w:tcPr>
           <w:p>
@@ -482,9 +516,11 @@
             <w:r/>
             <w:r>
               <w:rPr>
-                <w:rFonts w:ascii="Arial" w:hAnsi="Arial" w:cs="Arial"/>
+                <w:rFonts w:ascii="Tahoma" w:hAnsi="Tahoma" w:cs="Tahoma"/>
                 <w:b w:val="0"/>
                 <w:sz w:val="21"/>
+                <w:rtl w:val="1"/>
+                <w:lang w:val="ar-SA" w:bidi="ar-SA"/>
               </w:rPr>
               <w:t>اختبار قدرة الأشجار على التقاط الأنماط الواضحة في الخصائص.</w:t>
             </w:r>
@@ -497,10 +533,10 @@
             <w:tcW w:type="dxa" w:w="5270"/>
             <w:vAlign w:val="center"/>
             <w:tcMar>
-              <w:top w:w="110" w:type="dxa"/>
-              <w:start w:w="110" w:type="dxa"/>
-              <w:bottom w:w="110" w:type="dxa"/>
-              <w:end w:w="110" w:type="dxa"/>
+              <w:top w:w="120" w:type="dxa"/>
+              <w:start w:w="120" w:type="dxa"/>
+              <w:bottom w:w="120" w:type="dxa"/>
+              <w:end w:w="120" w:type="dxa"/>
             </w:tcMar>
           </w:tcPr>
           <w:p>
@@ -512,9 +548,11 @@
             <w:r/>
             <w:r>
               <w:rPr>
-                <w:rFonts w:ascii="Arial" w:hAnsi="Arial" w:cs="Arial"/>
+                <w:rFonts w:ascii="Tahoma" w:hAnsi="Tahoma" w:cs="Tahoma"/>
                 <w:b w:val="0"/>
                 <w:sz w:val="21"/>
+                <w:rtl w:val="1"/>
+                <w:lang w:val="ar-SA" w:bidi="ar-SA"/>
               </w:rPr>
               <w:t>Random Forest و Extra Trees</w:t>
             </w:r>
@@ -525,10 +563,10 @@
             <w:tcW w:type="dxa" w:w="5270"/>
             <w:vAlign w:val="center"/>
             <w:tcMar>
-              <w:top w:w="110" w:type="dxa"/>
-              <w:start w:w="110" w:type="dxa"/>
-              <w:bottom w:w="110" w:type="dxa"/>
-              <w:end w:w="110" w:type="dxa"/>
+              <w:top w:w="120" w:type="dxa"/>
+              <w:start w:w="120" w:type="dxa"/>
+              <w:bottom w:w="120" w:type="dxa"/>
+              <w:end w:w="120" w:type="dxa"/>
             </w:tcMar>
           </w:tcPr>
           <w:p>
@@ -540,9 +578,11 @@
             <w:r/>
             <w:r>
               <w:rPr>
-                <w:rFonts w:ascii="Arial" w:hAnsi="Arial" w:cs="Arial"/>
+                <w:rFonts w:ascii="Tahoma" w:hAnsi="Tahoma" w:cs="Tahoma"/>
                 <w:b w:val="0"/>
                 <w:sz w:val="21"/>
+                <w:rtl w:val="1"/>
+                <w:lang w:val="ar-SA" w:bidi="ar-SA"/>
               </w:rPr>
               <w:t>تقليل تذبذب الشجرة الواحدة عبر تجميع عدة أشجار.</w:t>
             </w:r>
@@ -555,10 +595,10 @@
             <w:tcW w:type="dxa" w:w="5270"/>
             <w:vAlign w:val="center"/>
             <w:tcMar>
-              <w:top w:w="110" w:type="dxa"/>
-              <w:start w:w="110" w:type="dxa"/>
-              <w:bottom w:w="110" w:type="dxa"/>
-              <w:end w:w="110" w:type="dxa"/>
+              <w:top w:w="120" w:type="dxa"/>
+              <w:start w:w="120" w:type="dxa"/>
+              <w:bottom w:w="120" w:type="dxa"/>
+              <w:end w:w="120" w:type="dxa"/>
             </w:tcMar>
           </w:tcPr>
           <w:p>
@@ -570,9 +610,11 @@
             <w:r/>
             <w:r>
               <w:rPr>
-                <w:rFonts w:ascii="Arial" w:hAnsi="Arial" w:cs="Arial"/>
+                <w:rFonts w:ascii="Tahoma" w:hAnsi="Tahoma" w:cs="Tahoma"/>
                 <w:b w:val="0"/>
                 <w:sz w:val="21"/>
+                <w:rtl w:val="1"/>
+                <w:lang w:val="ar-SA" w:bidi="ar-SA"/>
               </w:rPr>
               <w:t>Gradient Boosting و HistGradientBoosting</w:t>
             </w:r>
@@ -583,10 +625,10 @@
             <w:tcW w:type="dxa" w:w="5270"/>
             <w:vAlign w:val="center"/>
             <w:tcMar>
-              <w:top w:w="110" w:type="dxa"/>
-              <w:start w:w="110" w:type="dxa"/>
-              <w:bottom w:w="110" w:type="dxa"/>
-              <w:end w:w="110" w:type="dxa"/>
+              <w:top w:w="120" w:type="dxa"/>
+              <w:start w:w="120" w:type="dxa"/>
+              <w:bottom w:w="120" w:type="dxa"/>
+              <w:end w:w="120" w:type="dxa"/>
             </w:tcMar>
           </w:tcPr>
           <w:p>
@@ -598,9 +640,11 @@
             <w:r/>
             <w:r>
               <w:rPr>
-                <w:rFonts w:ascii="Arial" w:hAnsi="Arial" w:cs="Arial"/>
+                <w:rFonts w:ascii="Tahoma" w:hAnsi="Tahoma" w:cs="Tahoma"/>
                 <w:b w:val="0"/>
                 <w:sz w:val="21"/>
+                <w:rtl w:val="1"/>
+                <w:lang w:val="ar-SA" w:bidi="ar-SA"/>
               </w:rPr>
               <w:t>تجربة نماذج boosting مناسبة للبيانات الجدولية.</w:t>
             </w:r>
@@ -613,10 +657,10 @@
             <w:tcW w:type="dxa" w:w="5270"/>
             <w:vAlign w:val="center"/>
             <w:tcMar>
-              <w:top w:w="110" w:type="dxa"/>
-              <w:start w:w="110" w:type="dxa"/>
-              <w:bottom w:w="110" w:type="dxa"/>
-              <w:end w:w="110" w:type="dxa"/>
+              <w:top w:w="120" w:type="dxa"/>
+              <w:start w:w="120" w:type="dxa"/>
+              <w:bottom w:w="120" w:type="dxa"/>
+              <w:end w:w="120" w:type="dxa"/>
             </w:tcMar>
           </w:tcPr>
           <w:p>
@@ -628,9 +672,11 @@
             <w:r/>
             <w:r>
               <w:rPr>
-                <w:rFonts w:ascii="Arial" w:hAnsi="Arial" w:cs="Arial"/>
+                <w:rFonts w:ascii="Tahoma" w:hAnsi="Tahoma" w:cs="Tahoma"/>
                 <w:b w:val="0"/>
                 <w:sz w:val="21"/>
+                <w:rtl w:val="1"/>
+                <w:lang w:val="ar-SA" w:bidi="ar-SA"/>
               </w:rPr>
               <w:t>LightGBM و XGBoost</w:t>
             </w:r>
@@ -641,10 +687,10 @@
             <w:tcW w:type="dxa" w:w="5270"/>
             <w:vAlign w:val="center"/>
             <w:tcMar>
-              <w:top w:w="110" w:type="dxa"/>
-              <w:start w:w="110" w:type="dxa"/>
-              <w:bottom w:w="110" w:type="dxa"/>
-              <w:end w:w="110" w:type="dxa"/>
+              <w:top w:w="120" w:type="dxa"/>
+              <w:start w:w="120" w:type="dxa"/>
+              <w:bottom w:w="120" w:type="dxa"/>
+              <w:end w:w="120" w:type="dxa"/>
             </w:tcMar>
           </w:tcPr>
           <w:p>
@@ -656,9 +702,11 @@
             <w:r/>
             <w:r>
               <w:rPr>
-                <w:rFonts w:ascii="Arial" w:hAnsi="Arial" w:cs="Arial"/>
+                <w:rFonts w:ascii="Tahoma" w:hAnsi="Tahoma" w:cs="Tahoma"/>
                 <w:b w:val="0"/>
                 <w:sz w:val="21"/>
+                <w:rtl w:val="1"/>
+                <w:lang w:val="ar-SA" w:bidi="ar-SA"/>
               </w:rPr>
               <w:t>اختبار نماذج قوية على tabular data.</w:t>
             </w:r>
@@ -671,10 +719,10 @@
             <w:tcW w:type="dxa" w:w="5270"/>
             <w:vAlign w:val="center"/>
             <w:tcMar>
-              <w:top w:w="110" w:type="dxa"/>
-              <w:start w:w="110" w:type="dxa"/>
-              <w:bottom w:w="110" w:type="dxa"/>
-              <w:end w:w="110" w:type="dxa"/>
+              <w:top w:w="120" w:type="dxa"/>
+              <w:start w:w="120" w:type="dxa"/>
+              <w:bottom w:w="120" w:type="dxa"/>
+              <w:end w:w="120" w:type="dxa"/>
             </w:tcMar>
           </w:tcPr>
           <w:p>
@@ -686,9 +734,11 @@
             <w:r/>
             <w:r>
               <w:rPr>
-                <w:rFonts w:ascii="Arial" w:hAnsi="Arial" w:cs="Arial"/>
+                <w:rFonts w:ascii="Tahoma" w:hAnsi="Tahoma" w:cs="Tahoma"/>
                 <w:b w:val="0"/>
                 <w:sz w:val="21"/>
+                <w:rtl w:val="1"/>
+                <w:lang w:val="ar-SA" w:bidi="ar-SA"/>
               </w:rPr>
               <w:t>Unweighted LightGBM</w:t>
             </w:r>
@@ -699,10 +749,10 @@
             <w:tcW w:type="dxa" w:w="5270"/>
             <w:vAlign w:val="center"/>
             <w:tcMar>
-              <w:top w:w="110" w:type="dxa"/>
-              <w:start w:w="110" w:type="dxa"/>
-              <w:bottom w:w="110" w:type="dxa"/>
-              <w:end w:w="110" w:type="dxa"/>
+              <w:top w:w="120" w:type="dxa"/>
+              <w:start w:w="120" w:type="dxa"/>
+              <w:bottom w:w="120" w:type="dxa"/>
+              <w:end w:w="120" w:type="dxa"/>
             </w:tcMar>
           </w:tcPr>
           <w:p>
@@ -714,9 +764,11 @@
             <w:r/>
             <w:r>
               <w:rPr>
-                <w:rFonts w:ascii="Arial" w:hAnsi="Arial" w:cs="Arial"/>
+                <w:rFonts w:ascii="Tahoma" w:hAnsi="Tahoma" w:cs="Tahoma"/>
                 <w:b w:val="0"/>
                 <w:sz w:val="21"/>
+                <w:rtl w:val="1"/>
+                <w:lang w:val="ar-SA" w:bidi="ar-SA"/>
               </w:rPr>
               <w:t>مقارنة أثر إزالة class weights.</w:t>
             </w:r>
@@ -729,10 +781,10 @@
             <w:tcW w:type="dxa" w:w="5270"/>
             <w:vAlign w:val="center"/>
             <w:tcMar>
-              <w:top w:w="110" w:type="dxa"/>
-              <w:start w:w="110" w:type="dxa"/>
-              <w:bottom w:w="110" w:type="dxa"/>
-              <w:end w:w="110" w:type="dxa"/>
+              <w:top w:w="120" w:type="dxa"/>
+              <w:start w:w="120" w:type="dxa"/>
+              <w:bottom w:w="120" w:type="dxa"/>
+              <w:end w:w="120" w:type="dxa"/>
             </w:tcMar>
           </w:tcPr>
           <w:p>
@@ -744,9 +796,11 @@
             <w:r/>
             <w:r>
               <w:rPr>
-                <w:rFonts w:ascii="Arial" w:hAnsi="Arial" w:cs="Arial"/>
+                <w:rFonts w:ascii="Tahoma" w:hAnsi="Tahoma" w:cs="Tahoma"/>
                 <w:b w:val="0"/>
                 <w:sz w:val="21"/>
+                <w:rtl w:val="1"/>
+                <w:lang w:val="ar-SA" w:bidi="ar-SA"/>
               </w:rPr>
               <w:t>Core 4 Features Model</w:t>
             </w:r>
@@ -757,10 +811,10 @@
             <w:tcW w:type="dxa" w:w="5270"/>
             <w:vAlign w:val="center"/>
             <w:tcMar>
-              <w:top w:w="110" w:type="dxa"/>
-              <w:start w:w="110" w:type="dxa"/>
-              <w:bottom w:w="110" w:type="dxa"/>
-              <w:end w:w="110" w:type="dxa"/>
+              <w:top w:w="120" w:type="dxa"/>
+              <w:start w:w="120" w:type="dxa"/>
+              <w:bottom w:w="120" w:type="dxa"/>
+              <w:end w:w="120" w:type="dxa"/>
             </w:tcMar>
           </w:tcPr>
           <w:p>
@@ -772,9 +826,11 @@
             <w:r/>
             <w:r>
               <w:rPr>
-                <w:rFonts w:ascii="Arial" w:hAnsi="Arial" w:cs="Arial"/>
+                <w:rFonts w:ascii="Tahoma" w:hAnsi="Tahoma" w:cs="Tahoma"/>
                 <w:b w:val="0"/>
                 <w:sz w:val="21"/>
+                <w:rtl w:val="1"/>
+                <w:lang w:val="ar-SA" w:bidi="ar-SA"/>
               </w:rPr>
               <w:t>اختبار نموذج صغير يعتمد على أكثر الخصائص ظهوراً في التحليل.</w:t>
             </w:r>
@@ -787,10 +843,10 @@
             <w:tcW w:type="dxa" w:w="5270"/>
             <w:vAlign w:val="center"/>
             <w:tcMar>
-              <w:top w:w="110" w:type="dxa"/>
-              <w:start w:w="110" w:type="dxa"/>
-              <w:bottom w:w="110" w:type="dxa"/>
-              <w:end w:w="110" w:type="dxa"/>
+              <w:top w:w="120" w:type="dxa"/>
+              <w:start w:w="120" w:type="dxa"/>
+              <w:bottom w:w="120" w:type="dxa"/>
+              <w:end w:w="120" w:type="dxa"/>
             </w:tcMar>
           </w:tcPr>
           <w:p>
@@ -802,9 +858,11 @@
             <w:r/>
             <w:r>
               <w:rPr>
-                <w:rFonts w:ascii="Arial" w:hAnsi="Arial" w:cs="Arial"/>
+                <w:rFonts w:ascii="Tahoma" w:hAnsi="Tahoma" w:cs="Tahoma"/>
                 <w:b w:val="0"/>
                 <w:sz w:val="21"/>
+                <w:rtl w:val="1"/>
+                <w:lang w:val="ar-SA" w:bidi="ar-SA"/>
               </w:rPr>
               <w:t>ADASYN و BorderlineSMOTE</w:t>
             </w:r>
@@ -815,10 +873,10 @@
             <w:tcW w:type="dxa" w:w="5270"/>
             <w:vAlign w:val="center"/>
             <w:tcMar>
-              <w:top w:w="110" w:type="dxa"/>
-              <w:start w:w="110" w:type="dxa"/>
-              <w:bottom w:w="110" w:type="dxa"/>
-              <w:end w:w="110" w:type="dxa"/>
+              <w:top w:w="120" w:type="dxa"/>
+              <w:start w:w="120" w:type="dxa"/>
+              <w:bottom w:w="120" w:type="dxa"/>
+              <w:end w:w="120" w:type="dxa"/>
             </w:tcMar>
           </w:tcPr>
           <w:p>
@@ -830,9 +888,11 @@
             <w:r/>
             <w:r>
               <w:rPr>
-                <w:rFonts w:ascii="Arial" w:hAnsi="Arial" w:cs="Arial"/>
+                <w:rFonts w:ascii="Tahoma" w:hAnsi="Tahoma" w:cs="Tahoma"/>
                 <w:b w:val="0"/>
                 <w:sz w:val="21"/>
+                <w:rtl w:val="1"/>
+                <w:lang w:val="ar-SA" w:bidi="ar-SA"/>
               </w:rPr>
               <w:t>فحص أثر توليد أمثلة إضافية للفئات الأقل عدداً.</w:t>
             </w:r>
@@ -845,10 +905,10 @@
             <w:tcW w:type="dxa" w:w="5270"/>
             <w:vAlign w:val="center"/>
             <w:tcMar>
-              <w:top w:w="110" w:type="dxa"/>
-              <w:start w:w="110" w:type="dxa"/>
-              <w:bottom w:w="110" w:type="dxa"/>
-              <w:end w:w="110" w:type="dxa"/>
+              <w:top w:w="120" w:type="dxa"/>
+              <w:start w:w="120" w:type="dxa"/>
+              <w:bottom w:w="120" w:type="dxa"/>
+              <w:end w:w="120" w:type="dxa"/>
             </w:tcMar>
           </w:tcPr>
           <w:p>
@@ -860,9 +920,11 @@
             <w:r/>
             <w:r>
               <w:rPr>
-                <w:rFonts w:ascii="Arial" w:hAnsi="Arial" w:cs="Arial"/>
+                <w:rFonts w:ascii="Tahoma" w:hAnsi="Tahoma" w:cs="Tahoma"/>
                 <w:b w:val="0"/>
                 <w:sz w:val="21"/>
+                <w:rtl w:val="1"/>
+                <w:lang w:val="ar-SA" w:bidi="ar-SA"/>
               </w:rPr>
               <w:t>Soft Voting Ensemble</w:t>
             </w:r>
@@ -873,10 +935,10 @@
             <w:tcW w:type="dxa" w:w="5270"/>
             <w:vAlign w:val="center"/>
             <w:tcMar>
-              <w:top w:w="110" w:type="dxa"/>
-              <w:start w:w="110" w:type="dxa"/>
-              <w:bottom w:w="110" w:type="dxa"/>
-              <w:end w:w="110" w:type="dxa"/>
+              <w:top w:w="120" w:type="dxa"/>
+              <w:start w:w="120" w:type="dxa"/>
+              <w:bottom w:w="120" w:type="dxa"/>
+              <w:end w:w="120" w:type="dxa"/>
             </w:tcMar>
           </w:tcPr>
           <w:p>
@@ -888,9 +950,11 @@
             <w:r/>
             <w:r>
               <w:rPr>
-                <w:rFonts w:ascii="Arial" w:hAnsi="Arial" w:cs="Arial"/>
+                <w:rFonts w:ascii="Tahoma" w:hAnsi="Tahoma" w:cs="Tahoma"/>
                 <w:b w:val="0"/>
                 <w:sz w:val="21"/>
+                <w:rtl w:val="1"/>
+                <w:lang w:val="ar-SA" w:bidi="ar-SA"/>
               </w:rPr>
               <w:t>دمج احتمالات عدة نماذج عندما تكون أخطاؤها مختلفة.</w:t>
             </w:r>
@@ -901,76 +965,82 @@
     <w:p/>
     <w:p>
       <w:pPr>
-        <w:spacing w:line="348" w:lineRule="auto" w:after="160"/>
+        <w:spacing w:line="360" w:lineRule="auto" w:after="160"/>
         <w:jc w:val="right"/>
         <w:bidi w:val="1"/>
       </w:pPr>
       <w:r>
         <w:rPr>
-          <w:rFonts w:ascii="Arial" w:hAnsi="Arial" w:cs="Arial"/>
+          <w:rFonts w:ascii="Tahoma" w:hAnsi="Tahoma" w:cs="Tahoma"/>
           <w:b w:val="0"/>
           <w:sz w:val="22"/>
+          <w:rtl w:val="1"/>
+          <w:lang w:val="ar-SA" w:bidi="ar-SA"/>
         </w:rPr>
         <w:t>الهدف من هذه التجارب لم يكن فقط رفع النتيجة، بل معرفة أي النماذج أكثر ثباتاً وأيها يعطي أداء جيداً على الكلاسات الأقل عدداً.</w:t>
       </w:r>
     </w:p>
     <w:p>
       <w:pPr>
-        <w:spacing w:line="348" w:lineRule="auto" w:after="200"/>
+        <w:spacing w:line="360" w:lineRule="auto" w:after="200"/>
         <w:jc w:val="right"/>
         <w:bidi w:val="1"/>
       </w:pPr>
       <w:r>
         <w:rPr>
-          <w:rFonts w:ascii="Arial" w:hAnsi="Arial" w:cs="Arial"/>
+          <w:rFonts w:ascii="Tahoma" w:hAnsi="Tahoma" w:cs="Tahoma"/>
           <w:b/>
           <w:color w:val="2E74B5"/>
           <w:sz w:val="28"/>
+          <w:rtl w:val="1"/>
+          <w:lang w:val="ar-SA" w:bidi="ar-SA"/>
         </w:rPr>
         <w:t>5. إدارة البيانات باستخدام DVC</w:t>
       </w:r>
     </w:p>
     <w:p>
       <w:pPr>
-        <w:spacing w:line="348" w:lineRule="auto" w:after="160"/>
+        <w:spacing w:line="360" w:lineRule="auto" w:after="160"/>
         <w:jc w:val="right"/>
         <w:bidi w:val="1"/>
       </w:pPr>
       <w:r>
         <w:rPr>
-          <w:rFonts w:ascii="Arial" w:hAnsi="Arial" w:cs="Arial"/>
+          <w:rFonts w:ascii="Tahoma" w:hAnsi="Tahoma" w:cs="Tahoma"/>
           <w:b w:val="0"/>
           <w:sz w:val="22"/>
+          <w:rtl w:val="1"/>
+          <w:lang w:val="ar-SA" w:bidi="ar-SA"/>
         </w:rPr>
         <w:t>استخدمنا DVC لتتبع ملفات البيانات بدل رفع ملفات CSV الخام إلى GitHub. هذا يجعل المستودع أخف، ويعطي طريقة واضحة لأي عضو في الفريق ليسترجع نفس نسخة البيانات.</w:t>
       </w:r>
     </w:p>
     <w:p>
       <w:pPr>
-        <w:spacing w:line="348" w:lineRule="auto" w:after="160"/>
+        <w:spacing w:line="360" w:lineRule="auto" w:after="160"/>
         <w:jc w:val="right"/>
         <w:bidi w:val="1"/>
       </w:pPr>
       <w:r>
         <w:rPr>
-          <w:rFonts w:ascii="Arial" w:hAnsi="Arial" w:cs="Arial"/>
+          <w:rFonts w:ascii="Tahoma" w:hAnsi="Tahoma" w:cs="Tahoma"/>
           <w:b/>
           <w:sz w:val="22"/>
+          <w:rtl w:val="1"/>
+          <w:lang w:val="ar-SA" w:bidi="ar-SA"/>
         </w:rPr>
         <w:t>رابط مستودع GitHub:</w:t>
       </w:r>
     </w:p>
     <w:p>
       <w:pPr>
-        <w:spacing w:before="40" w:after="200"/>
-        <w:ind w:left="142" w:right="142"/>
+        <w:spacing w:after="200"/>
         <w:jc w:val="left"/>
       </w:pPr>
       <w:r>
         <w:rPr>
-          <w:rFonts w:ascii="Arial" w:hAnsi="Arial" w:cs="Arial"/>
-          <w:b w:val="0"/>
-          <w:color w:val="282828"/>
+          <w:rFonts w:ascii="Consolas" w:hAnsi="Consolas"/>
+          <w:color w:val="323232"/>
           <w:sz w:val="20"/>
         </w:rPr>
         <w:t>https://github.com/AhmadMurad10/FITE-Classification-Challenge</w:t>
@@ -978,30 +1048,30 @@
     </w:p>
     <w:p>
       <w:pPr>
-        <w:spacing w:line="348" w:lineRule="auto" w:after="160"/>
+        <w:spacing w:line="360" w:lineRule="auto" w:after="160"/>
         <w:jc w:val="right"/>
         <w:bidi w:val="1"/>
       </w:pPr>
       <w:r>
         <w:rPr>
-          <w:rFonts w:ascii="Arial" w:hAnsi="Arial" w:cs="Arial"/>
+          <w:rFonts w:ascii="Tahoma" w:hAnsi="Tahoma" w:cs="Tahoma"/>
           <w:b/>
           <w:sz w:val="22"/>
+          <w:rtl w:val="1"/>
+          <w:lang w:val="ar-SA" w:bidi="ar-SA"/>
         </w:rPr>
         <w:t>الـ DVC remote مضبوط على Google Drive:</w:t>
       </w:r>
     </w:p>
     <w:p>
       <w:pPr>
-        <w:spacing w:before="40" w:after="200"/>
-        <w:ind w:left="142" w:right="142"/>
+        <w:spacing w:after="200"/>
         <w:jc w:val="left"/>
       </w:pPr>
       <w:r>
         <w:rPr>
-          <w:rFonts w:ascii="Arial" w:hAnsi="Arial" w:cs="Arial"/>
-          <w:b w:val="0"/>
-          <w:color w:val="282828"/>
+          <w:rFonts w:ascii="Consolas" w:hAnsi="Consolas"/>
+          <w:color w:val="323232"/>
           <w:sz w:val="20"/>
         </w:rPr>
         <w:t>gdrive://12AfjjB_qMloHxg0oZsQ4fbWs3zYJCeAo</w:t>
@@ -1009,30 +1079,30 @@
     </w:p>
     <w:p>
       <w:pPr>
-        <w:spacing w:line="348" w:lineRule="auto" w:after="160"/>
+        <w:spacing w:line="360" w:lineRule="auto" w:after="160"/>
         <w:jc w:val="right"/>
         <w:bidi w:val="1"/>
       </w:pPr>
       <w:r>
         <w:rPr>
-          <w:rFonts w:ascii="Arial" w:hAnsi="Arial" w:cs="Arial"/>
+          <w:rFonts w:ascii="Tahoma" w:hAnsi="Tahoma" w:cs="Tahoma"/>
           <w:b/>
           <w:sz w:val="22"/>
+          <w:rtl w:val="1"/>
+          <w:lang w:val="ar-SA" w:bidi="ar-SA"/>
         </w:rPr>
         <w:t>لاسترجاع البيانات على جهاز جديد:</w:t>
       </w:r>
     </w:p>
     <w:p>
       <w:pPr>
-        <w:spacing w:before="40" w:after="200"/>
-        <w:ind w:left="142" w:right="142"/>
+        <w:spacing w:after="200"/>
         <w:jc w:val="left"/>
       </w:pPr>
       <w:r>
         <w:rPr>
-          <w:rFonts w:ascii="Arial" w:hAnsi="Arial" w:cs="Arial"/>
-          <w:b w:val="0"/>
-          <w:color w:val="282828"/>
+          <w:rFonts w:ascii="Consolas" w:hAnsi="Consolas"/>
+          <w:color w:val="323232"/>
           <w:sz w:val="20"/>
         </w:rPr>
         <w:t>pip install -r requirements.txt</w:t>
@@ -1042,9 +1112,8 @@
       </w:r>
       <w:r>
         <w:rPr>
-          <w:rFonts w:ascii="Arial" w:hAnsi="Arial" w:cs="Arial"/>
-          <w:b w:val="0"/>
-          <w:color w:val="282828"/>
+          <w:rFonts w:ascii="Consolas" w:hAnsi="Consolas"/>
+          <w:color w:val="323232"/>
           <w:sz w:val="20"/>
         </w:rPr>
         <w:t>dvc pull</w:t>
@@ -1052,46 +1121,52 @@
     </w:p>
     <w:p>
       <w:pPr>
-        <w:spacing w:line="348" w:lineRule="auto" w:after="160"/>
+        <w:spacing w:line="360" w:lineRule="auto" w:after="160"/>
         <w:jc w:val="right"/>
         <w:bidi w:val="1"/>
       </w:pPr>
       <w:r>
         <w:rPr>
-          <w:rFonts w:ascii="Arial" w:hAnsi="Arial" w:cs="Arial"/>
+          <w:rFonts w:ascii="Tahoma" w:hAnsi="Tahoma" w:cs="Tahoma"/>
           <w:b w:val="0"/>
           <w:sz w:val="22"/>
+          <w:rtl w:val="1"/>
+          <w:lang w:val="ar-SA" w:bidi="ar-SA"/>
         </w:rPr>
         <w:t>يجب أن يكون لدى المستخدم صلاحية وصول إلى فولدر Google Drive قبل تنفيذ dvc pull.</w:t>
       </w:r>
     </w:p>
     <w:p>
       <w:pPr>
-        <w:spacing w:line="348" w:lineRule="auto" w:after="200"/>
+        <w:spacing w:line="360" w:lineRule="auto" w:after="200"/>
         <w:jc w:val="right"/>
         <w:bidi w:val="1"/>
       </w:pPr>
       <w:r>
         <w:rPr>
-          <w:rFonts w:ascii="Arial" w:hAnsi="Arial" w:cs="Arial"/>
+          <w:rFonts w:ascii="Tahoma" w:hAnsi="Tahoma" w:cs="Tahoma"/>
           <w:b/>
           <w:color w:val="2E74B5"/>
           <w:sz w:val="28"/>
+          <w:rtl w:val="1"/>
+          <w:lang w:val="ar-SA" w:bidi="ar-SA"/>
         </w:rPr>
         <w:t>6. خلاصة</w:t>
       </w:r>
     </w:p>
     <w:p>
       <w:pPr>
-        <w:spacing w:line="348" w:lineRule="auto" w:after="160"/>
+        <w:spacing w:line="360" w:lineRule="auto" w:after="160"/>
         <w:jc w:val="right"/>
         <w:bidi w:val="1"/>
       </w:pPr>
       <w:r>
         <w:rPr>
-          <w:rFonts w:ascii="Arial" w:hAnsi="Arial" w:cs="Arial"/>
+          <w:rFonts w:ascii="Tahoma" w:hAnsi="Tahoma" w:cs="Tahoma"/>
           <w:b w:val="0"/>
           <w:sz w:val="22"/>
+          <w:rtl w:val="1"/>
+          <w:lang w:val="ar-SA" w:bidi="ar-SA"/>
         </w:rPr>
         <w:t>تم بناء pipeline قابل للإعادة، وتسجيل التجارب باستخدام MLflow، وتتبع البيانات باستخدام DVC. كما تمت مقارنة عدة نماذج ومقاييس بدل الاعتماد على نتيجة واحدة. هذا يعطينا توثيقاً واضحاً لكيفية الوصول إلى النموذج النهائي، ويسهّل مراجعة التجارب أو إعادة تشغيلها لاحقاً.</w:t>
       </w:r>
@@ -1469,9 +1544,12 @@
     <w:name w:val="Normal"/>
     <w:qFormat/>
     <w:rsid w:val="00FC693F"/>
+    <w:pPr>
+      <w:bidi w:val="1"/>
+      <w:jc w:val="right"/>
+    </w:pPr>
     <w:rPr>
-      <w:rFonts w:ascii="Arial" w:hAnsi="Arial" w:cs="Arial"/>
-      <w:sz w:val="22"/>
+      <w:rFonts w:ascii="Tahoma" w:hAnsi="Tahoma" w:cs="Tahoma"/>
     </w:rPr>
   </w:style>
   <w:style w:type="paragraph" w:styleId="Header">
@@ -1531,9 +1609,11 @@
       <w:keepLines/>
       <w:spacing w:before="480" w:after="0"/>
       <w:outlineLvl w:val="0"/>
+      <w:bidi w:val="1"/>
+      <w:jc w:val="right"/>
     </w:pPr>
     <w:rPr>
-      <w:rFonts w:asciiTheme="majorHAnsi" w:eastAsiaTheme="majorEastAsia" w:hAnsiTheme="majorHAnsi" w:cstheme="majorBidi"/>
+      <w:rFonts w:asciiTheme="majorHAnsi" w:eastAsiaTheme="majorEastAsia" w:hAnsiTheme="majorHAnsi" w:cstheme="majorBidi" w:ascii="Tahoma" w:hAnsi="Tahoma" w:cs="Tahoma"/>
       <w:b/>
       <w:bCs/>
       <w:color w:val="365F91" w:themeColor="accent1" w:themeShade="BF"/>
@@ -1555,9 +1635,11 @@
       <w:keepLines/>
       <w:spacing w:before="200" w:after="0"/>
       <w:outlineLvl w:val="1"/>
+      <w:bidi w:val="1"/>
+      <w:jc w:val="right"/>
     </w:pPr>
     <w:rPr>
-      <w:rFonts w:asciiTheme="majorHAnsi" w:eastAsiaTheme="majorEastAsia" w:hAnsiTheme="majorHAnsi" w:cstheme="majorBidi"/>
+      <w:rFonts w:asciiTheme="majorHAnsi" w:eastAsiaTheme="majorEastAsia" w:hAnsiTheme="majorHAnsi" w:cstheme="majorBidi" w:ascii="Tahoma" w:hAnsi="Tahoma" w:cs="Tahoma"/>
       <w:b/>
       <w:bCs/>
       <w:color w:val="4F81BD" w:themeColor="accent1"/>

</xml_diff>